<commit_message>
SEQUOIADBMAINSTREAM-663: add queryandupdate & queryandremove to REST doc
git-svn-id: http://192.168.20.11/sequoiadb/trunk@18104 6121f079-4a18-41d3-8c30-8870a322f2c2
</commit_message>
<xml_diff>
--- a/internal_doc/03.开发设计/rest/sequoiadb Rest接口.docx
+++ b/internal_doc/03.开发设计/rest/sequoiadb Rest接口.docx
@@ -3936,6 +3936,1613 @@
         <w:rPr>
           <w:rFonts w:hint="eastAsia"/>
         </w:rPr>
+        <w:t>查询</w:t>
+      </w:r>
+      <w:r>
+        <w:rPr>
+          <w:rFonts w:hint="eastAsia"/>
+        </w:rPr>
+        <w:t>更新</w:t>
+      </w:r>
+      <w:r>
+        <w:rPr>
+          <w:rFonts w:hint="eastAsia"/>
+        </w:rPr>
+        <w:t>数据</w:t>
+      </w:r>
+    </w:p>
+    <w:tbl>
+      <w:tblPr>
+        <w:tblStyle w:val="TableGrid"/>
+        <w:tblW w:w="8789" w:type="dxa"/>
+        <w:tblInd w:w="-34" w:type="dxa"/>
+        <w:tblLayout w:type="fixed"/>
+        <w:tblLook w:val="04A0"/>
+      </w:tblPr>
+      <w:tblGrid>
+        <w:gridCol w:w="1418"/>
+        <w:gridCol w:w="3827"/>
+        <w:gridCol w:w="3544"/>
+      </w:tblGrid>
+      <w:tr>
+        <w:tc>
+          <w:tcPr>
+            <w:tcW w:w="1418" w:type="dxa"/>
+            <w:shd w:val="clear" w:color="auto" w:fill="DDD9C3" w:themeFill="background2" w:themeFillShade="E6"/>
+          </w:tcPr>
+          <w:p>
+            <w:pPr>
+              <w:ind w:left="0"/>
+            </w:pPr>
+          </w:p>
+        </w:tc>
+        <w:tc>
+          <w:tcPr>
+            <w:tcW w:w="3827" w:type="dxa"/>
+            <w:shd w:val="clear" w:color="auto" w:fill="DDD9C3" w:themeFill="background2" w:themeFillShade="E6"/>
+          </w:tcPr>
+          <w:p>
+            <w:pPr>
+              <w:ind w:left="0"/>
+            </w:pPr>
+            <w:r>
+              <w:rPr>
+                <w:rFonts w:hint="eastAsia"/>
+              </w:rPr>
+              <w:t>说明</w:t>
+            </w:r>
+          </w:p>
+        </w:tc>
+        <w:tc>
+          <w:tcPr>
+            <w:tcW w:w="3544" w:type="dxa"/>
+            <w:shd w:val="clear" w:color="auto" w:fill="DDD9C3" w:themeFill="background2" w:themeFillShade="E6"/>
+          </w:tcPr>
+          <w:p>
+            <w:pPr>
+              <w:ind w:left="0"/>
+            </w:pPr>
+            <w:r>
+              <w:rPr>
+                <w:rFonts w:hint="eastAsia"/>
+              </w:rPr>
+              <w:t>举例</w:t>
+            </w:r>
+          </w:p>
+        </w:tc>
+      </w:tr>
+      <w:tr>
+        <w:tc>
+          <w:tcPr>
+            <w:tcW w:w="1418" w:type="dxa"/>
+          </w:tcPr>
+          <w:p>
+            <w:pPr>
+              <w:ind w:left="0"/>
+            </w:pPr>
+            <w:r>
+              <w:rPr>
+                <w:rFonts w:hint="eastAsia"/>
+              </w:rPr>
+              <w:t>请求头</w:t>
+            </w:r>
+          </w:p>
+        </w:tc>
+        <w:tc>
+          <w:tcPr>
+            <w:tcW w:w="3827" w:type="dxa"/>
+          </w:tcPr>
+          <w:p>
+            <w:pPr>
+              <w:ind w:left="0"/>
+            </w:pPr>
+            <w:r>
+              <w:rPr>
+                <w:rFonts w:hint="eastAsia"/>
+              </w:rPr>
+              <w:t>同通用请求头</w:t>
+            </w:r>
+          </w:p>
+        </w:tc>
+        <w:tc>
+          <w:tcPr>
+            <w:tcW w:w="3544" w:type="dxa"/>
+          </w:tcPr>
+          <w:p>
+            <w:pPr>
+              <w:ind w:left="0"/>
+            </w:pPr>
+          </w:p>
+        </w:tc>
+      </w:tr>
+      <w:tr>
+        <w:tc>
+          <w:tcPr>
+            <w:tcW w:w="1418" w:type="dxa"/>
+          </w:tcPr>
+          <w:p>
+            <w:pPr>
+              <w:ind w:left="0"/>
+            </w:pPr>
+            <w:r>
+              <w:rPr>
+                <w:rFonts w:hint="eastAsia"/>
+              </w:rPr>
+              <w:t>请求内容</w:t>
+            </w:r>
+          </w:p>
+        </w:tc>
+        <w:tc>
+          <w:tcPr>
+            <w:tcW w:w="3827" w:type="dxa"/>
+          </w:tcPr>
+          <w:p>
+            <w:pPr>
+              <w:ind w:left="0"/>
+              <w:rPr>
+                <w:rFonts w:hint="eastAsia"/>
+              </w:rPr>
+            </w:pPr>
+            <w:r>
+              <w:t>cmd</w:t>
+            </w:r>
+            <w:r>
+              <w:rPr>
+                <w:rFonts w:hint="eastAsia"/>
+              </w:rPr>
+              <w:t xml:space="preserve">: </w:t>
+            </w:r>
+            <w:r>
+              <w:t>query</w:t>
+            </w:r>
+            <w:r>
+              <w:rPr>
+                <w:rFonts w:hint="eastAsia"/>
+              </w:rPr>
+              <w:t>andupdate</w:t>
+            </w:r>
+          </w:p>
+          <w:p>
+            <w:pPr>
+              <w:ind w:left="0"/>
+              <w:rPr>
+                <w:rFonts w:hint="eastAsia"/>
+              </w:rPr>
+            </w:pPr>
+            <w:r>
+              <w:t>name</w:t>
+            </w:r>
+            <w:r>
+              <w:rPr>
+                <w:rFonts w:hint="eastAsia"/>
+              </w:rPr>
+              <w:t>:</w:t>
+            </w:r>
+            <w:r>
+              <w:rPr>
+                <w:rFonts w:hint="eastAsia"/>
+              </w:rPr>
+              <w:t>集合的全称</w:t>
+            </w:r>
+            <w:r>
+              <w:rPr>
+                <w:rFonts w:hint="eastAsia"/>
+              </w:rPr>
+              <w:t>(</w:t>
+            </w:r>
+            <w:r>
+              <w:rPr>
+                <w:rFonts w:hint="eastAsia"/>
+              </w:rPr>
+              <w:t>集合空间</w:t>
+            </w:r>
+            <w:r>
+              <w:rPr>
+                <w:rFonts w:hint="eastAsia"/>
+              </w:rPr>
+              <w:t>.</w:t>
+            </w:r>
+            <w:r>
+              <w:rPr>
+                <w:rFonts w:hint="eastAsia"/>
+              </w:rPr>
+              <w:t>集合</w:t>
+            </w:r>
+            <w:r>
+              <w:rPr>
+                <w:rFonts w:hint="eastAsia"/>
+              </w:rPr>
+              <w:t>)</w:t>
+            </w:r>
+          </w:p>
+          <w:p>
+            <w:pPr>
+              <w:ind w:left="0"/>
+            </w:pPr>
+            <w:r>
+              <w:rPr>
+                <w:rFonts w:hint="eastAsia"/>
+              </w:rPr>
+              <w:t xml:space="preserve">updator: </w:t>
+            </w:r>
+            <w:r>
+              <w:rPr>
+                <w:rFonts w:hint="eastAsia"/>
+              </w:rPr>
+              <w:t>更新操作</w:t>
+            </w:r>
+          </w:p>
+          <w:p>
+            <w:pPr>
+              <w:ind w:left="0"/>
+            </w:pPr>
+            <w:r>
+              <w:rPr>
+                <w:rFonts w:hint="eastAsia"/>
+              </w:rPr>
+              <w:t xml:space="preserve">sort: </w:t>
+            </w:r>
+            <w:r>
+              <w:rPr>
+                <w:rFonts w:hint="eastAsia"/>
+              </w:rPr>
+              <w:t>排序字段名</w:t>
+            </w:r>
+            <w:r>
+              <w:rPr>
+                <w:rFonts w:hint="eastAsia"/>
+              </w:rPr>
+              <w:t>(</w:t>
+            </w:r>
+            <w:r>
+              <w:rPr>
+                <w:rFonts w:hint="eastAsia"/>
+              </w:rPr>
+              <w:t>可选参数</w:t>
+            </w:r>
+            <w:r>
+              <w:rPr>
+                <w:rFonts w:hint="eastAsia"/>
+              </w:rPr>
+              <w:t>，可不填</w:t>
+            </w:r>
+            <w:r>
+              <w:rPr>
+                <w:rFonts w:hint="eastAsia"/>
+              </w:rPr>
+              <w:t>)</w:t>
+            </w:r>
+          </w:p>
+          <w:p>
+            <w:pPr>
+              <w:ind w:left="0"/>
+            </w:pPr>
+            <w:r>
+              <w:rPr>
+                <w:rFonts w:hint="eastAsia"/>
+              </w:rPr>
+              <w:t xml:space="preserve">selector: </w:t>
+            </w:r>
+            <w:r>
+              <w:rPr>
+                <w:rFonts w:hint="eastAsia"/>
+              </w:rPr>
+              <w:t>查询结果列</w:t>
+            </w:r>
+            <w:r>
+              <w:rPr>
+                <w:rFonts w:hint="eastAsia"/>
+              </w:rPr>
+              <w:t>(</w:t>
+            </w:r>
+            <w:r>
+              <w:rPr>
+                <w:rFonts w:hint="eastAsia"/>
+              </w:rPr>
+              <w:t>可选参数</w:t>
+            </w:r>
+            <w:r>
+              <w:rPr>
+                <w:rFonts w:hint="eastAsia"/>
+              </w:rPr>
+              <w:t>，可不填</w:t>
+            </w:r>
+            <w:r>
+              <w:rPr>
+                <w:rFonts w:hint="eastAsia"/>
+              </w:rPr>
+              <w:t>)</w:t>
+            </w:r>
+          </w:p>
+          <w:p>
+            <w:pPr>
+              <w:ind w:left="0"/>
+            </w:pPr>
+            <w:r>
+              <w:rPr>
+                <w:rFonts w:hint="eastAsia"/>
+              </w:rPr>
+              <w:t>skip</w:t>
+            </w:r>
+            <w:r>
+              <w:rPr>
+                <w:rFonts w:hint="eastAsia"/>
+              </w:rPr>
+              <w:t>：跳过多少行</w:t>
+            </w:r>
+            <w:r>
+              <w:rPr>
+                <w:rFonts w:hint="eastAsia"/>
+              </w:rPr>
+              <w:t>(</w:t>
+            </w:r>
+            <w:r>
+              <w:rPr>
+                <w:rFonts w:hint="eastAsia"/>
+              </w:rPr>
+              <w:t>可选参数</w:t>
+            </w:r>
+            <w:r>
+              <w:rPr>
+                <w:rFonts w:hint="eastAsia"/>
+              </w:rPr>
+              <w:t>，可不填</w:t>
+            </w:r>
+            <w:r>
+              <w:rPr>
+                <w:rFonts w:hint="eastAsia"/>
+              </w:rPr>
+              <w:t>)</w:t>
+            </w:r>
+          </w:p>
+          <w:p>
+            <w:pPr>
+              <w:ind w:left="0"/>
+            </w:pPr>
+            <w:r>
+              <w:rPr>
+                <w:rFonts w:hint="eastAsia"/>
+              </w:rPr>
+              <w:t>returnnum</w:t>
+            </w:r>
+            <w:r>
+              <w:rPr>
+                <w:rFonts w:hint="eastAsia"/>
+              </w:rPr>
+              <w:t>：最大返回条数</w:t>
+            </w:r>
+            <w:r>
+              <w:rPr>
+                <w:rFonts w:hint="eastAsia"/>
+              </w:rPr>
+              <w:t>(</w:t>
+            </w:r>
+            <w:r>
+              <w:rPr>
+                <w:rFonts w:hint="eastAsia"/>
+              </w:rPr>
+              <w:t>可选参数</w:t>
+            </w:r>
+            <w:r>
+              <w:rPr>
+                <w:rFonts w:hint="eastAsia"/>
+              </w:rPr>
+              <w:t>，可不填</w:t>
+            </w:r>
+            <w:r>
+              <w:rPr>
+                <w:rFonts w:hint="eastAsia"/>
+              </w:rPr>
+              <w:t>)</w:t>
+            </w:r>
+          </w:p>
+          <w:p>
+            <w:pPr>
+              <w:ind w:left="0"/>
+              <w:rPr>
+                <w:rFonts w:hint="eastAsia"/>
+              </w:rPr>
+            </w:pPr>
+            <w:r>
+              <w:rPr>
+                <w:rFonts w:hint="eastAsia"/>
+              </w:rPr>
+              <w:t>filter</w:t>
+            </w:r>
+            <w:r>
+              <w:rPr>
+                <w:rFonts w:hint="eastAsia"/>
+              </w:rPr>
+              <w:t>：查询条件</w:t>
+            </w:r>
+            <w:r>
+              <w:rPr>
+                <w:rFonts w:hint="eastAsia"/>
+              </w:rPr>
+              <w:t>(</w:t>
+            </w:r>
+            <w:r>
+              <w:rPr>
+                <w:rFonts w:hint="eastAsia"/>
+              </w:rPr>
+              <w:t>可选参数</w:t>
+            </w:r>
+            <w:r>
+              <w:rPr>
+                <w:rFonts w:hint="eastAsia"/>
+              </w:rPr>
+              <w:t>，可不填</w:t>
+            </w:r>
+            <w:r>
+              <w:rPr>
+                <w:rFonts w:hint="eastAsia"/>
+              </w:rPr>
+              <w:t>)</w:t>
+            </w:r>
+          </w:p>
+          <w:p>
+            <w:pPr>
+              <w:ind w:left="0"/>
+            </w:pPr>
+            <w:r>
+              <w:rPr>
+                <w:rFonts w:hint="eastAsia"/>
+              </w:rPr>
+              <w:t xml:space="preserve">returnnew: </w:t>
+            </w:r>
+            <w:r>
+              <w:rPr>
+                <w:rFonts w:hint="eastAsia"/>
+              </w:rPr>
+              <w:t>是否返回更新后记录</w:t>
+            </w:r>
+            <w:r>
+              <w:rPr>
+                <w:rFonts w:hint="eastAsia"/>
+              </w:rPr>
+              <w:t>(</w:t>
+            </w:r>
+            <w:r>
+              <w:rPr>
+                <w:rFonts w:hint="eastAsia"/>
+              </w:rPr>
+              <w:t>可选参数</w:t>
+            </w:r>
+            <w:r>
+              <w:rPr>
+                <w:rFonts w:hint="eastAsia"/>
+              </w:rPr>
+              <w:t>，可不填</w:t>
+            </w:r>
+            <w:r>
+              <w:rPr>
+                <w:rFonts w:hint="eastAsia"/>
+              </w:rPr>
+              <w:t>)</w:t>
+            </w:r>
+          </w:p>
+        </w:tc>
+        <w:tc>
+          <w:tcPr>
+            <w:tcW w:w="3544" w:type="dxa"/>
+          </w:tcPr>
+          <w:p>
+            <w:pPr>
+              <w:ind w:left="0"/>
+            </w:pPr>
+            <w:r>
+              <w:t>cmd=</w:t>
+            </w:r>
+            <w:r>
+              <w:t>query</w:t>
+            </w:r>
+            <w:r>
+              <w:rPr>
+                <w:rFonts w:hint="eastAsia"/>
+              </w:rPr>
+              <w:t>andupdate</w:t>
+            </w:r>
+            <w:r>
+              <w:t>&amp;name=cs</w:t>
+            </w:r>
+            <w:r>
+              <w:rPr>
+                <w:rFonts w:hint="eastAsia"/>
+              </w:rPr>
+              <w:t>.cl</w:t>
+            </w:r>
+            <w:r>
+              <w:rPr>
+                <w:rFonts w:hint="eastAsia"/>
+              </w:rPr>
+              <w:t>&amp;updator=</w:t>
+            </w:r>
+            <w:r>
+              <w:t>{$set:{"age":100}}</w:t>
+            </w:r>
+            <w:r>
+              <w:rPr>
+                <w:rFonts w:hint="eastAsia"/>
+              </w:rPr>
+              <w:t>&amp;</w:t>
+            </w:r>
+            <w:r>
+              <w:t>filter={"name":"hello</w:t>
+            </w:r>
+            <w:r>
+              <w:t>"}</w:t>
+            </w:r>
+          </w:p>
+        </w:tc>
+      </w:tr>
+      <w:tr>
+        <w:tc>
+          <w:tcPr>
+            <w:tcW w:w="1418" w:type="dxa"/>
+          </w:tcPr>
+          <w:p>
+            <w:pPr>
+              <w:ind w:left="0"/>
+            </w:pPr>
+            <w:r>
+              <w:rPr>
+                <w:rFonts w:hint="eastAsia"/>
+              </w:rPr>
+              <w:t>说明</w:t>
+            </w:r>
+          </w:p>
+        </w:tc>
+        <w:tc>
+          <w:tcPr>
+            <w:tcW w:w="3827" w:type="dxa"/>
+          </w:tcPr>
+          <w:p>
+            <w:pPr>
+              <w:ind w:left="0"/>
+            </w:pPr>
+          </w:p>
+        </w:tc>
+        <w:tc>
+          <w:tcPr>
+            <w:tcW w:w="3544" w:type="dxa"/>
+          </w:tcPr>
+          <w:p>
+            <w:pPr>
+              <w:ind w:left="0"/>
+            </w:pPr>
+          </w:p>
+        </w:tc>
+      </w:tr>
+      <w:tr>
+        <w:tc>
+          <w:tcPr>
+            <w:tcW w:w="1418" w:type="dxa"/>
+          </w:tcPr>
+          <w:p>
+            <w:pPr>
+              <w:ind w:left="0"/>
+            </w:pPr>
+            <w:r>
+              <w:rPr>
+                <w:rFonts w:hint="eastAsia"/>
+              </w:rPr>
+              <w:t>响应头</w:t>
+            </w:r>
+          </w:p>
+        </w:tc>
+        <w:tc>
+          <w:tcPr>
+            <w:tcW w:w="3827" w:type="dxa"/>
+          </w:tcPr>
+          <w:p>
+            <w:pPr>
+              <w:ind w:left="0"/>
+            </w:pPr>
+            <w:r>
+              <w:rPr>
+                <w:rFonts w:hint="eastAsia"/>
+              </w:rPr>
+              <w:t>同通用响应头</w:t>
+            </w:r>
+          </w:p>
+        </w:tc>
+        <w:tc>
+          <w:tcPr>
+            <w:tcW w:w="3544" w:type="dxa"/>
+          </w:tcPr>
+          <w:p>
+            <w:pPr>
+              <w:ind w:left="0"/>
+            </w:pPr>
+          </w:p>
+        </w:tc>
+      </w:tr>
+      <w:tr>
+        <w:tc>
+          <w:tcPr>
+            <w:tcW w:w="1418" w:type="dxa"/>
+          </w:tcPr>
+          <w:p>
+            <w:pPr>
+              <w:ind w:left="0"/>
+            </w:pPr>
+            <w:r>
+              <w:rPr>
+                <w:rFonts w:hint="eastAsia"/>
+              </w:rPr>
+              <w:t>响应内容</w:t>
+            </w:r>
+          </w:p>
+        </w:tc>
+        <w:tc>
+          <w:tcPr>
+            <w:tcW w:w="3827" w:type="dxa"/>
+          </w:tcPr>
+          <w:p>
+            <w:pPr>
+              <w:ind w:left="0"/>
+            </w:pPr>
+            <w:r>
+              <w:rPr>
+                <w:rFonts w:hint="eastAsia"/>
+              </w:rPr>
+              <w:t>{</w:t>
+            </w:r>
+          </w:p>
+          <w:p>
+            <w:pPr>
+              <w:ind w:left="0" w:firstLineChars="100" w:firstLine="210"/>
+            </w:pPr>
+            <w:r>
+              <w:rPr>
+                <w:rFonts w:hint="eastAsia"/>
+              </w:rPr>
+              <w:t>errno:</w:t>
+            </w:r>
+            <w:r>
+              <w:rPr>
+                <w:rFonts w:hint="eastAsia"/>
+              </w:rPr>
+              <w:t>返回值</w:t>
+            </w:r>
+            <w:r>
+              <w:rPr>
+                <w:rFonts w:hint="eastAsia"/>
+              </w:rPr>
+              <w:t>, 0</w:t>
+            </w:r>
+            <w:r>
+              <w:rPr>
+                <w:rFonts w:hint="eastAsia"/>
+              </w:rPr>
+              <w:t>表示成功</w:t>
+            </w:r>
+            <w:r>
+              <w:rPr>
+                <w:rFonts w:hint="eastAsia"/>
+              </w:rPr>
+              <w:t>,</w:t>
+            </w:r>
+            <w:r>
+              <w:rPr>
+                <w:rFonts w:hint="eastAsia"/>
+              </w:rPr>
+              <w:t>其他为失败</w:t>
+            </w:r>
+          </w:p>
+          <w:p>
+            <w:pPr>
+              <w:ind w:left="0" w:firstLineChars="100" w:firstLine="210"/>
+            </w:pPr>
+            <w:r>
+              <w:t>description</w:t>
+            </w:r>
+            <w:r>
+              <w:rPr>
+                <w:rFonts w:hint="eastAsia"/>
+              </w:rPr>
+              <w:t>:</w:t>
+            </w:r>
+            <w:r>
+              <w:rPr>
+                <w:rFonts w:hint="eastAsia"/>
+              </w:rPr>
+              <w:t>失败时的错误描述</w:t>
+            </w:r>
+          </w:p>
+          <w:p>
+            <w:pPr>
+              <w:ind w:left="0"/>
+            </w:pPr>
+            <w:r>
+              <w:rPr>
+                <w:rFonts w:hint="eastAsia"/>
+              </w:rPr>
+              <w:t>}</w:t>
+            </w:r>
+          </w:p>
+          <w:p>
+            <w:pPr>
+              <w:ind w:left="0"/>
+            </w:pPr>
+            <w:r>
+              <w:rPr>
+                <w:rFonts w:hint="eastAsia"/>
+              </w:rPr>
+              <w:t>{</w:t>
+            </w:r>
+          </w:p>
+          <w:p>
+            <w:pPr>
+              <w:ind w:left="0"/>
+            </w:pPr>
+            <w:r>
+              <w:rPr>
+                <w:rFonts w:hint="eastAsia"/>
+              </w:rPr>
+              <w:t xml:space="preserve">  </w:t>
+            </w:r>
+            <w:r>
+              <w:rPr>
+                <w:rFonts w:hint="eastAsia"/>
+              </w:rPr>
+              <w:t>返回表里的记录</w:t>
+            </w:r>
+          </w:p>
+          <w:p>
+            <w:pPr>
+              <w:ind w:left="0"/>
+            </w:pPr>
+            <w:r>
+              <w:rPr>
+                <w:rFonts w:hint="eastAsia"/>
+              </w:rPr>
+              <w:t>}</w:t>
+            </w:r>
+          </w:p>
+          <w:p>
+            <w:pPr>
+              <w:ind w:left="0"/>
+            </w:pPr>
+            <w:r>
+              <w:t>…</w:t>
+            </w:r>
+          </w:p>
+        </w:tc>
+        <w:tc>
+          <w:tcPr>
+            <w:tcW w:w="3544" w:type="dxa"/>
+          </w:tcPr>
+          <w:p>
+            <w:pPr>
+              <w:ind w:left="0"/>
+            </w:pPr>
+            <w:r>
+              <w:t>{ "errno": 0 }{ "_id": { "$oid": "54def7</w:t>
+            </w:r>
+            <w:r>
+              <w:t xml:space="preserve">2f0d8737161d9d6934" }, "age": </w:t>
+            </w:r>
+            <w:r>
+              <w:rPr>
+                <w:rFonts w:hint="eastAsia"/>
+              </w:rPr>
+              <w:t>12</w:t>
+            </w:r>
+            <w:r>
+              <w:t>, "name": "hello" }</w:t>
+            </w:r>
+          </w:p>
+        </w:tc>
+      </w:tr>
+      <w:tr>
+        <w:tc>
+          <w:tcPr>
+            <w:tcW w:w="1418" w:type="dxa"/>
+          </w:tcPr>
+          <w:p>
+            <w:pPr>
+              <w:ind w:left="0"/>
+            </w:pPr>
+            <w:r>
+              <w:rPr>
+                <w:rFonts w:hint="eastAsia"/>
+              </w:rPr>
+              <w:t>说明</w:t>
+            </w:r>
+          </w:p>
+        </w:tc>
+        <w:tc>
+          <w:tcPr>
+            <w:tcW w:w="3827" w:type="dxa"/>
+          </w:tcPr>
+          <w:p>
+            <w:pPr>
+              <w:ind w:left="0"/>
+            </w:pPr>
+          </w:p>
+        </w:tc>
+        <w:tc>
+          <w:tcPr>
+            <w:tcW w:w="3544" w:type="dxa"/>
+          </w:tcPr>
+          <w:p>
+            <w:pPr>
+              <w:ind w:left="0"/>
+            </w:pPr>
+          </w:p>
+        </w:tc>
+      </w:tr>
+    </w:tbl>
+    <w:p>
+      <w:pPr>
+        <w:pStyle w:val="Heading4"/>
+        <w:numPr>
+          <w:ilvl w:val="0"/>
+          <w:numId w:val="16"/>
+        </w:numPr>
+      </w:pPr>
+      <w:r>
+        <w:rPr>
+          <w:rFonts w:hint="eastAsia"/>
+        </w:rPr>
+        <w:lastRenderedPageBreak/>
+        <w:t>查询</w:t>
+      </w:r>
+      <w:r>
+        <w:rPr>
+          <w:rFonts w:hint="eastAsia"/>
+        </w:rPr>
+        <w:t>删除</w:t>
+      </w:r>
+      <w:r>
+        <w:rPr>
+          <w:rFonts w:hint="eastAsia"/>
+        </w:rPr>
+        <w:t>数据</w:t>
+      </w:r>
+    </w:p>
+    <w:tbl>
+      <w:tblPr>
+        <w:tblStyle w:val="TableGrid"/>
+        <w:tblW w:w="8789" w:type="dxa"/>
+        <w:tblInd w:w="-34" w:type="dxa"/>
+        <w:tblLayout w:type="fixed"/>
+        <w:tblLook w:val="04A0"/>
+      </w:tblPr>
+      <w:tblGrid>
+        <w:gridCol w:w="1418"/>
+        <w:gridCol w:w="3827"/>
+        <w:gridCol w:w="3544"/>
+      </w:tblGrid>
+      <w:tr>
+        <w:tc>
+          <w:tcPr>
+            <w:tcW w:w="1418" w:type="dxa"/>
+            <w:shd w:val="clear" w:color="auto" w:fill="DDD9C3" w:themeFill="background2" w:themeFillShade="E6"/>
+          </w:tcPr>
+          <w:p>
+            <w:pPr>
+              <w:ind w:left="0"/>
+            </w:pPr>
+          </w:p>
+        </w:tc>
+        <w:tc>
+          <w:tcPr>
+            <w:tcW w:w="3827" w:type="dxa"/>
+            <w:shd w:val="clear" w:color="auto" w:fill="DDD9C3" w:themeFill="background2" w:themeFillShade="E6"/>
+          </w:tcPr>
+          <w:p>
+            <w:pPr>
+              <w:ind w:left="0"/>
+            </w:pPr>
+            <w:r>
+              <w:rPr>
+                <w:rFonts w:hint="eastAsia"/>
+              </w:rPr>
+              <w:t>说明</w:t>
+            </w:r>
+          </w:p>
+        </w:tc>
+        <w:tc>
+          <w:tcPr>
+            <w:tcW w:w="3544" w:type="dxa"/>
+            <w:shd w:val="clear" w:color="auto" w:fill="DDD9C3" w:themeFill="background2" w:themeFillShade="E6"/>
+          </w:tcPr>
+          <w:p>
+            <w:pPr>
+              <w:ind w:left="0"/>
+            </w:pPr>
+            <w:r>
+              <w:rPr>
+                <w:rFonts w:hint="eastAsia"/>
+              </w:rPr>
+              <w:t>举例</w:t>
+            </w:r>
+          </w:p>
+        </w:tc>
+      </w:tr>
+      <w:tr>
+        <w:tc>
+          <w:tcPr>
+            <w:tcW w:w="1418" w:type="dxa"/>
+          </w:tcPr>
+          <w:p>
+            <w:pPr>
+              <w:ind w:left="0"/>
+            </w:pPr>
+            <w:r>
+              <w:rPr>
+                <w:rFonts w:hint="eastAsia"/>
+              </w:rPr>
+              <w:t>请求头</w:t>
+            </w:r>
+          </w:p>
+        </w:tc>
+        <w:tc>
+          <w:tcPr>
+            <w:tcW w:w="3827" w:type="dxa"/>
+          </w:tcPr>
+          <w:p>
+            <w:pPr>
+              <w:ind w:left="0"/>
+            </w:pPr>
+            <w:r>
+              <w:rPr>
+                <w:rFonts w:hint="eastAsia"/>
+              </w:rPr>
+              <w:t>同通用请求头</w:t>
+            </w:r>
+          </w:p>
+        </w:tc>
+        <w:tc>
+          <w:tcPr>
+            <w:tcW w:w="3544" w:type="dxa"/>
+          </w:tcPr>
+          <w:p>
+            <w:pPr>
+              <w:ind w:left="0"/>
+            </w:pPr>
+          </w:p>
+        </w:tc>
+      </w:tr>
+      <w:tr>
+        <w:tc>
+          <w:tcPr>
+            <w:tcW w:w="1418" w:type="dxa"/>
+          </w:tcPr>
+          <w:p>
+            <w:pPr>
+              <w:ind w:left="0"/>
+            </w:pPr>
+            <w:r>
+              <w:rPr>
+                <w:rFonts w:hint="eastAsia"/>
+              </w:rPr>
+              <w:t>请求内容</w:t>
+            </w:r>
+          </w:p>
+        </w:tc>
+        <w:tc>
+          <w:tcPr>
+            <w:tcW w:w="3827" w:type="dxa"/>
+          </w:tcPr>
+          <w:p>
+            <w:pPr>
+              <w:ind w:left="0"/>
+            </w:pPr>
+            <w:r>
+              <w:t>cmd</w:t>
+            </w:r>
+            <w:r>
+              <w:rPr>
+                <w:rFonts w:hint="eastAsia"/>
+              </w:rPr>
+              <w:t xml:space="preserve">: </w:t>
+            </w:r>
+            <w:r>
+              <w:t>query</w:t>
+            </w:r>
+            <w:r>
+              <w:rPr>
+                <w:rFonts w:hint="eastAsia"/>
+              </w:rPr>
+              <w:t>andremove</w:t>
+            </w:r>
+          </w:p>
+          <w:p>
+            <w:pPr>
+              <w:ind w:left="0"/>
+            </w:pPr>
+            <w:r>
+              <w:t>name</w:t>
+            </w:r>
+            <w:r>
+              <w:rPr>
+                <w:rFonts w:hint="eastAsia"/>
+              </w:rPr>
+              <w:t>:</w:t>
+            </w:r>
+            <w:r>
+              <w:rPr>
+                <w:rFonts w:hint="eastAsia"/>
+              </w:rPr>
+              <w:t>集合的全称</w:t>
+            </w:r>
+            <w:r>
+              <w:rPr>
+                <w:rFonts w:hint="eastAsia"/>
+              </w:rPr>
+              <w:t>(</w:t>
+            </w:r>
+            <w:r>
+              <w:rPr>
+                <w:rFonts w:hint="eastAsia"/>
+              </w:rPr>
+              <w:t>集合空间</w:t>
+            </w:r>
+            <w:r>
+              <w:rPr>
+                <w:rFonts w:hint="eastAsia"/>
+              </w:rPr>
+              <w:t>.</w:t>
+            </w:r>
+            <w:r>
+              <w:rPr>
+                <w:rFonts w:hint="eastAsia"/>
+              </w:rPr>
+              <w:t>集合</w:t>
+            </w:r>
+            <w:r>
+              <w:rPr>
+                <w:rFonts w:hint="eastAsia"/>
+              </w:rPr>
+              <w:t>)</w:t>
+            </w:r>
+          </w:p>
+          <w:p>
+            <w:pPr>
+              <w:ind w:left="0"/>
+            </w:pPr>
+            <w:r>
+              <w:rPr>
+                <w:rFonts w:hint="eastAsia"/>
+              </w:rPr>
+              <w:t xml:space="preserve">sort: </w:t>
+            </w:r>
+            <w:r>
+              <w:rPr>
+                <w:rFonts w:hint="eastAsia"/>
+              </w:rPr>
+              <w:t>排序字段名</w:t>
+            </w:r>
+            <w:r>
+              <w:rPr>
+                <w:rFonts w:hint="eastAsia"/>
+              </w:rPr>
+              <w:t>(</w:t>
+            </w:r>
+            <w:r>
+              <w:rPr>
+                <w:rFonts w:hint="eastAsia"/>
+              </w:rPr>
+              <w:t>可选参数</w:t>
+            </w:r>
+            <w:r>
+              <w:rPr>
+                <w:rFonts w:hint="eastAsia"/>
+              </w:rPr>
+              <w:t>，可不填</w:t>
+            </w:r>
+            <w:r>
+              <w:rPr>
+                <w:rFonts w:hint="eastAsia"/>
+              </w:rPr>
+              <w:t>)</w:t>
+            </w:r>
+          </w:p>
+          <w:p>
+            <w:pPr>
+              <w:ind w:left="0"/>
+            </w:pPr>
+            <w:r>
+              <w:rPr>
+                <w:rFonts w:hint="eastAsia"/>
+              </w:rPr>
+              <w:t xml:space="preserve">selector: </w:t>
+            </w:r>
+            <w:r>
+              <w:rPr>
+                <w:rFonts w:hint="eastAsia"/>
+              </w:rPr>
+              <w:t>查询结果列</w:t>
+            </w:r>
+            <w:r>
+              <w:rPr>
+                <w:rFonts w:hint="eastAsia"/>
+              </w:rPr>
+              <w:t>(</w:t>
+            </w:r>
+            <w:r>
+              <w:rPr>
+                <w:rFonts w:hint="eastAsia"/>
+              </w:rPr>
+              <w:t>可选参数</w:t>
+            </w:r>
+            <w:r>
+              <w:rPr>
+                <w:rFonts w:hint="eastAsia"/>
+              </w:rPr>
+              <w:t>，可不填</w:t>
+            </w:r>
+            <w:r>
+              <w:rPr>
+                <w:rFonts w:hint="eastAsia"/>
+              </w:rPr>
+              <w:t>)</w:t>
+            </w:r>
+          </w:p>
+          <w:p>
+            <w:pPr>
+              <w:ind w:left="0"/>
+            </w:pPr>
+            <w:r>
+              <w:rPr>
+                <w:rFonts w:hint="eastAsia"/>
+              </w:rPr>
+              <w:t>skip</w:t>
+            </w:r>
+            <w:r>
+              <w:rPr>
+                <w:rFonts w:hint="eastAsia"/>
+              </w:rPr>
+              <w:t>：跳过多少行</w:t>
+            </w:r>
+            <w:r>
+              <w:rPr>
+                <w:rFonts w:hint="eastAsia"/>
+              </w:rPr>
+              <w:t>(</w:t>
+            </w:r>
+            <w:r>
+              <w:rPr>
+                <w:rFonts w:hint="eastAsia"/>
+              </w:rPr>
+              <w:t>可选参数</w:t>
+            </w:r>
+            <w:r>
+              <w:rPr>
+                <w:rFonts w:hint="eastAsia"/>
+              </w:rPr>
+              <w:t>，可不填</w:t>
+            </w:r>
+            <w:r>
+              <w:rPr>
+                <w:rFonts w:hint="eastAsia"/>
+              </w:rPr>
+              <w:t>)</w:t>
+            </w:r>
+          </w:p>
+          <w:p>
+            <w:pPr>
+              <w:ind w:left="0"/>
+            </w:pPr>
+            <w:r>
+              <w:rPr>
+                <w:rFonts w:hint="eastAsia"/>
+              </w:rPr>
+              <w:t>returnnum</w:t>
+            </w:r>
+            <w:r>
+              <w:rPr>
+                <w:rFonts w:hint="eastAsia"/>
+              </w:rPr>
+              <w:t>：最大返回条数</w:t>
+            </w:r>
+            <w:r>
+              <w:rPr>
+                <w:rFonts w:hint="eastAsia"/>
+              </w:rPr>
+              <w:t>(</w:t>
+            </w:r>
+            <w:r>
+              <w:rPr>
+                <w:rFonts w:hint="eastAsia"/>
+              </w:rPr>
+              <w:t>可选参数</w:t>
+            </w:r>
+            <w:r>
+              <w:rPr>
+                <w:rFonts w:hint="eastAsia"/>
+              </w:rPr>
+              <w:t>，可不填</w:t>
+            </w:r>
+            <w:r>
+              <w:rPr>
+                <w:rFonts w:hint="eastAsia"/>
+              </w:rPr>
+              <w:t>)</w:t>
+            </w:r>
+          </w:p>
+          <w:p>
+            <w:pPr>
+              <w:ind w:left="0"/>
+            </w:pPr>
+            <w:r>
+              <w:rPr>
+                <w:rFonts w:hint="eastAsia"/>
+              </w:rPr>
+              <w:t>filter</w:t>
+            </w:r>
+            <w:r>
+              <w:rPr>
+                <w:rFonts w:hint="eastAsia"/>
+              </w:rPr>
+              <w:t>：查询条件</w:t>
+            </w:r>
+            <w:r>
+              <w:rPr>
+                <w:rFonts w:hint="eastAsia"/>
+              </w:rPr>
+              <w:t>(</w:t>
+            </w:r>
+            <w:r>
+              <w:rPr>
+                <w:rFonts w:hint="eastAsia"/>
+              </w:rPr>
+              <w:t>可选参数</w:t>
+            </w:r>
+            <w:r>
+              <w:rPr>
+                <w:rFonts w:hint="eastAsia"/>
+              </w:rPr>
+              <w:t>，可不填</w:t>
+            </w:r>
+            <w:r>
+              <w:rPr>
+                <w:rFonts w:hint="eastAsia"/>
+              </w:rPr>
+              <w:t>)</w:t>
+            </w:r>
+          </w:p>
+        </w:tc>
+        <w:tc>
+          <w:tcPr>
+            <w:tcW w:w="3544" w:type="dxa"/>
+          </w:tcPr>
+          <w:p>
+            <w:pPr>
+              <w:ind w:left="0"/>
+            </w:pPr>
+            <w:r>
+              <w:t>cmd=</w:t>
+            </w:r>
+            <w:r>
+              <w:t>query</w:t>
+            </w:r>
+            <w:r>
+              <w:rPr>
+                <w:rFonts w:hint="eastAsia"/>
+              </w:rPr>
+              <w:t>andremove</w:t>
+            </w:r>
+            <w:r>
+              <w:t>&amp;name=cs</w:t>
+            </w:r>
+            <w:r>
+              <w:rPr>
+                <w:rFonts w:hint="eastAsia"/>
+              </w:rPr>
+              <w:t>.cl&amp;</w:t>
+            </w:r>
+            <w:r>
+              <w:t>filter={"name":"hello</w:t>
+            </w:r>
+            <w:r>
+              <w:t>"}</w:t>
+            </w:r>
+          </w:p>
+        </w:tc>
+      </w:tr>
+      <w:tr>
+        <w:tc>
+          <w:tcPr>
+            <w:tcW w:w="1418" w:type="dxa"/>
+          </w:tcPr>
+          <w:p>
+            <w:pPr>
+              <w:ind w:left="0"/>
+            </w:pPr>
+            <w:r>
+              <w:rPr>
+                <w:rFonts w:hint="eastAsia"/>
+              </w:rPr>
+              <w:t>说明</w:t>
+            </w:r>
+          </w:p>
+        </w:tc>
+        <w:tc>
+          <w:tcPr>
+            <w:tcW w:w="3827" w:type="dxa"/>
+          </w:tcPr>
+          <w:p>
+            <w:pPr>
+              <w:ind w:left="0"/>
+            </w:pPr>
+          </w:p>
+        </w:tc>
+        <w:tc>
+          <w:tcPr>
+            <w:tcW w:w="3544" w:type="dxa"/>
+          </w:tcPr>
+          <w:p>
+            <w:pPr>
+              <w:ind w:left="0"/>
+            </w:pPr>
+          </w:p>
+        </w:tc>
+      </w:tr>
+      <w:tr>
+        <w:tc>
+          <w:tcPr>
+            <w:tcW w:w="1418" w:type="dxa"/>
+          </w:tcPr>
+          <w:p>
+            <w:pPr>
+              <w:ind w:left="0"/>
+            </w:pPr>
+            <w:r>
+              <w:rPr>
+                <w:rFonts w:hint="eastAsia"/>
+              </w:rPr>
+              <w:t>响应头</w:t>
+            </w:r>
+          </w:p>
+        </w:tc>
+        <w:tc>
+          <w:tcPr>
+            <w:tcW w:w="3827" w:type="dxa"/>
+          </w:tcPr>
+          <w:p>
+            <w:pPr>
+              <w:ind w:left="0"/>
+            </w:pPr>
+            <w:r>
+              <w:rPr>
+                <w:rFonts w:hint="eastAsia"/>
+              </w:rPr>
+              <w:t>同通用响应头</w:t>
+            </w:r>
+          </w:p>
+        </w:tc>
+        <w:tc>
+          <w:tcPr>
+            <w:tcW w:w="3544" w:type="dxa"/>
+          </w:tcPr>
+          <w:p>
+            <w:pPr>
+              <w:ind w:left="0"/>
+            </w:pPr>
+          </w:p>
+        </w:tc>
+      </w:tr>
+      <w:tr>
+        <w:tc>
+          <w:tcPr>
+            <w:tcW w:w="1418" w:type="dxa"/>
+          </w:tcPr>
+          <w:p>
+            <w:pPr>
+              <w:ind w:left="0"/>
+            </w:pPr>
+            <w:r>
+              <w:rPr>
+                <w:rFonts w:hint="eastAsia"/>
+              </w:rPr>
+              <w:t>响应内容</w:t>
+            </w:r>
+          </w:p>
+        </w:tc>
+        <w:tc>
+          <w:tcPr>
+            <w:tcW w:w="3827" w:type="dxa"/>
+          </w:tcPr>
+          <w:p>
+            <w:pPr>
+              <w:ind w:left="0"/>
+            </w:pPr>
+            <w:r>
+              <w:rPr>
+                <w:rFonts w:hint="eastAsia"/>
+              </w:rPr>
+              <w:t>{</w:t>
+            </w:r>
+          </w:p>
+          <w:p>
+            <w:pPr>
+              <w:ind w:left="0" w:firstLineChars="100" w:firstLine="210"/>
+            </w:pPr>
+            <w:r>
+              <w:rPr>
+                <w:rFonts w:hint="eastAsia"/>
+              </w:rPr>
+              <w:t>errno:</w:t>
+            </w:r>
+            <w:r>
+              <w:rPr>
+                <w:rFonts w:hint="eastAsia"/>
+              </w:rPr>
+              <w:t>返回值</w:t>
+            </w:r>
+            <w:r>
+              <w:rPr>
+                <w:rFonts w:hint="eastAsia"/>
+              </w:rPr>
+              <w:t>, 0</w:t>
+            </w:r>
+            <w:r>
+              <w:rPr>
+                <w:rFonts w:hint="eastAsia"/>
+              </w:rPr>
+              <w:t>表示成功</w:t>
+            </w:r>
+            <w:r>
+              <w:rPr>
+                <w:rFonts w:hint="eastAsia"/>
+              </w:rPr>
+              <w:t>,</w:t>
+            </w:r>
+            <w:r>
+              <w:rPr>
+                <w:rFonts w:hint="eastAsia"/>
+              </w:rPr>
+              <w:t>其他为失败</w:t>
+            </w:r>
+          </w:p>
+          <w:p>
+            <w:pPr>
+              <w:ind w:left="0" w:firstLineChars="100" w:firstLine="210"/>
+            </w:pPr>
+            <w:r>
+              <w:t>description</w:t>
+            </w:r>
+            <w:r>
+              <w:rPr>
+                <w:rFonts w:hint="eastAsia"/>
+              </w:rPr>
+              <w:t>:</w:t>
+            </w:r>
+            <w:r>
+              <w:rPr>
+                <w:rFonts w:hint="eastAsia"/>
+              </w:rPr>
+              <w:t>失败时的错误描述</w:t>
+            </w:r>
+          </w:p>
+          <w:p>
+            <w:pPr>
+              <w:ind w:left="0"/>
+            </w:pPr>
+            <w:r>
+              <w:rPr>
+                <w:rFonts w:hint="eastAsia"/>
+              </w:rPr>
+              <w:t>}</w:t>
+            </w:r>
+          </w:p>
+          <w:p>
+            <w:pPr>
+              <w:ind w:left="0"/>
+            </w:pPr>
+            <w:r>
+              <w:rPr>
+                <w:rFonts w:hint="eastAsia"/>
+              </w:rPr>
+              <w:t>{</w:t>
+            </w:r>
+          </w:p>
+          <w:p>
+            <w:pPr>
+              <w:ind w:left="0"/>
+            </w:pPr>
+            <w:r>
+              <w:rPr>
+                <w:rFonts w:hint="eastAsia"/>
+              </w:rPr>
+              <w:t xml:space="preserve">  </w:t>
+            </w:r>
+            <w:r>
+              <w:rPr>
+                <w:rFonts w:hint="eastAsia"/>
+              </w:rPr>
+              <w:t>返回表里的记录</w:t>
+            </w:r>
+          </w:p>
+          <w:p>
+            <w:pPr>
+              <w:ind w:left="0"/>
+            </w:pPr>
+            <w:r>
+              <w:rPr>
+                <w:rFonts w:hint="eastAsia"/>
+              </w:rPr>
+              <w:t>}</w:t>
+            </w:r>
+          </w:p>
+          <w:p>
+            <w:pPr>
+              <w:ind w:left="0"/>
+            </w:pPr>
+            <w:r>
+              <w:t>…</w:t>
+            </w:r>
+          </w:p>
+        </w:tc>
+        <w:tc>
+          <w:tcPr>
+            <w:tcW w:w="3544" w:type="dxa"/>
+          </w:tcPr>
+          <w:p>
+            <w:pPr>
+              <w:ind w:left="0"/>
+            </w:pPr>
+            <w:r>
+              <w:t>{ "errno": 0 }{ "_id": { "$oid": "54def72f0d8737161d9d6934" }, "age": 12, "name": "hello" }</w:t>
+            </w:r>
+          </w:p>
+        </w:tc>
+      </w:tr>
+      <w:tr>
+        <w:tc>
+          <w:tcPr>
+            <w:tcW w:w="1418" w:type="dxa"/>
+          </w:tcPr>
+          <w:p>
+            <w:pPr>
+              <w:ind w:left="0"/>
+            </w:pPr>
+            <w:r>
+              <w:rPr>
+                <w:rFonts w:hint="eastAsia"/>
+              </w:rPr>
+              <w:t>说明</w:t>
+            </w:r>
+          </w:p>
+        </w:tc>
+        <w:tc>
+          <w:tcPr>
+            <w:tcW w:w="3827" w:type="dxa"/>
+          </w:tcPr>
+          <w:p>
+            <w:pPr>
+              <w:ind w:left="0"/>
+            </w:pPr>
+          </w:p>
+        </w:tc>
+        <w:tc>
+          <w:tcPr>
+            <w:tcW w:w="3544" w:type="dxa"/>
+          </w:tcPr>
+          <w:p>
+            <w:pPr>
+              <w:ind w:left="0"/>
+            </w:pPr>
+          </w:p>
+        </w:tc>
+      </w:tr>
+    </w:tbl>
+    <w:p>
+      <w:pPr>
+        <w:pStyle w:val="Heading4"/>
+        <w:numPr>
+          <w:ilvl w:val="0"/>
+          <w:numId w:val="16"/>
+        </w:numPr>
+      </w:pPr>
+      <w:r>
+        <w:rPr>
+          <w:rFonts w:hint="eastAsia"/>
+        </w:rPr>
         <w:t>删除记录</w:t>
       </w:r>
     </w:p>
@@ -4446,6 +6053,7 @@
         <w:rPr>
           <w:rFonts w:hint="eastAsia"/>
         </w:rPr>
+        <w:lastRenderedPageBreak/>
         <w:t>更新记录</w:t>
       </w:r>
     </w:p>
@@ -4750,7 +6358,6 @@
               <w:rPr>
                 <w:rFonts w:hint="eastAsia"/>
               </w:rPr>
-              <w:lastRenderedPageBreak/>
               <w:t>响应头</w:t>
             </w:r>
           </w:p>
@@ -5709,6 +7316,7 @@
               <w:rPr>
                 <w:rFonts w:hint="eastAsia"/>
               </w:rPr>
+              <w:lastRenderedPageBreak/>
               <w:t>说明</w:t>
             </w:r>
           </w:p>
@@ -5948,7 +7556,6 @@
         <w:rPr>
           <w:rFonts w:hint="eastAsia"/>
         </w:rPr>
-        <w:lastRenderedPageBreak/>
         <w:t>表分区</w:t>
       </w:r>
     </w:p>
@@ -6932,6 +8539,7 @@
               <w:rPr>
                 <w:rFonts w:hint="eastAsia"/>
               </w:rPr>
+              <w:lastRenderedPageBreak/>
               <w:t>说明</w:t>
             </w:r>
           </w:p>
@@ -7460,102 +9068,13 @@
     </w:lvl>
   </w:abstractNum>
   <w:abstractNum w:abstractNumId="5">
-    <w:nsid w:val="23EC5C36"/>
+    <w:nsid w:val="23AE05AC"/>
     <w:multiLevelType w:val="hybridMultilevel"/>
-    <w:tmpl w:val="3338448C"/>
-    <w:lvl w:ilvl="0" w:tplc="CAA6CD50">
+    <w:tmpl w:val="1BCA5592"/>
+    <w:lvl w:ilvl="0" w:tplc="868C3356">
       <w:start w:val="1"/>
       <w:numFmt w:val="decimal"/>
-      <w:lvlText w:val="%1."/>
-      <w:lvlJc w:val="left"/>
-      <w:pPr>
-        <w:ind w:left="360" w:hanging="360"/>
-      </w:pPr>
-      <w:rPr>
-        <w:rFonts w:hint="default"/>
-      </w:rPr>
-    </w:lvl>
-    <w:lvl w:ilvl="1" w:tplc="04090019" w:tentative="1">
-      <w:start w:val="1"/>
-      <w:numFmt w:val="lowerLetter"/>
-      <w:lvlText w:val="%2)"/>
-      <w:lvlJc w:val="left"/>
-      <w:pPr>
-        <w:ind w:left="840" w:hanging="420"/>
-      </w:pPr>
-    </w:lvl>
-    <w:lvl w:ilvl="2" w:tplc="0409001B" w:tentative="1">
-      <w:start w:val="1"/>
-      <w:numFmt w:val="lowerRoman"/>
-      <w:lvlText w:val="%3."/>
-      <w:lvlJc w:val="right"/>
-      <w:pPr>
-        <w:ind w:left="1260" w:hanging="420"/>
-      </w:pPr>
-    </w:lvl>
-    <w:lvl w:ilvl="3" w:tplc="0409000F" w:tentative="1">
-      <w:start w:val="1"/>
-      <w:numFmt w:val="decimal"/>
-      <w:lvlText w:val="%4."/>
-      <w:lvlJc w:val="left"/>
-      <w:pPr>
-        <w:ind w:left="1680" w:hanging="420"/>
-      </w:pPr>
-    </w:lvl>
-    <w:lvl w:ilvl="4" w:tplc="04090019" w:tentative="1">
-      <w:start w:val="1"/>
-      <w:numFmt w:val="lowerLetter"/>
-      <w:lvlText w:val="%5)"/>
-      <w:lvlJc w:val="left"/>
-      <w:pPr>
-        <w:ind w:left="2100" w:hanging="420"/>
-      </w:pPr>
-    </w:lvl>
-    <w:lvl w:ilvl="5" w:tplc="0409001B" w:tentative="1">
-      <w:start w:val="1"/>
-      <w:numFmt w:val="lowerRoman"/>
-      <w:lvlText w:val="%6."/>
-      <w:lvlJc w:val="right"/>
-      <w:pPr>
-        <w:ind w:left="2520" w:hanging="420"/>
-      </w:pPr>
-    </w:lvl>
-    <w:lvl w:ilvl="6" w:tplc="0409000F" w:tentative="1">
-      <w:start w:val="1"/>
-      <w:numFmt w:val="decimal"/>
-      <w:lvlText w:val="%7."/>
-      <w:lvlJc w:val="left"/>
-      <w:pPr>
-        <w:ind w:left="2940" w:hanging="420"/>
-      </w:pPr>
-    </w:lvl>
-    <w:lvl w:ilvl="7" w:tplc="04090019" w:tentative="1">
-      <w:start w:val="1"/>
-      <w:numFmt w:val="lowerLetter"/>
-      <w:lvlText w:val="%8)"/>
-      <w:lvlJc w:val="left"/>
-      <w:pPr>
-        <w:ind w:left="3360" w:hanging="420"/>
-      </w:pPr>
-    </w:lvl>
-    <w:lvl w:ilvl="8" w:tplc="0409001B" w:tentative="1">
-      <w:start w:val="1"/>
-      <w:numFmt w:val="lowerRoman"/>
-      <w:lvlText w:val="%9."/>
-      <w:lvlJc w:val="right"/>
-      <w:pPr>
-        <w:ind w:left="3780" w:hanging="420"/>
-      </w:pPr>
-    </w:lvl>
-  </w:abstractNum>
-  <w:abstractNum w:abstractNumId="6">
-    <w:nsid w:val="26751AAE"/>
-    <w:multiLevelType w:val="hybridMultilevel"/>
-    <w:tmpl w:val="0B8092AA"/>
-    <w:lvl w:ilvl="0" w:tplc="5014724A">
-      <w:start w:val="1"/>
-      <w:numFmt w:val="decimal"/>
-      <w:lvlText w:val="1.%1."/>
+      <w:lvlText w:val="4.%1."/>
       <w:lvlJc w:val="left"/>
       <w:pPr>
         <w:ind w:left="777" w:hanging="420"/>
@@ -7640,14 +9159,14 @@
       </w:pPr>
     </w:lvl>
   </w:abstractNum>
-  <w:abstractNum w:abstractNumId="7">
-    <w:nsid w:val="2A7215BE"/>
+  <w:abstractNum w:abstractNumId="6">
+    <w:nsid w:val="23EC5C36"/>
     <w:multiLevelType w:val="hybridMultilevel"/>
-    <w:tmpl w:val="9D847B2C"/>
-    <w:lvl w:ilvl="0" w:tplc="9BCC915A">
+    <w:tmpl w:val="3338448C"/>
+    <w:lvl w:ilvl="0" w:tplc="CAA6CD50">
       <w:start w:val="1"/>
       <w:numFmt w:val="decimal"/>
-      <w:lvlText w:val="%1、"/>
+      <w:lvlText w:val="%1."/>
       <w:lvlJc w:val="left"/>
       <w:pPr>
         <w:ind w:left="360" w:hanging="360"/>
@@ -7729,189 +9248,14 @@
       </w:pPr>
     </w:lvl>
   </w:abstractNum>
-  <w:abstractNum w:abstractNumId="8">
-    <w:nsid w:val="339640A5"/>
+  <w:abstractNum w:abstractNumId="7">
+    <w:nsid w:val="26751AAE"/>
     <w:multiLevelType w:val="hybridMultilevel"/>
-    <w:tmpl w:val="DBC828E0"/>
-    <w:lvl w:ilvl="0" w:tplc="B25E5DA4">
+    <w:tmpl w:val="0B8092AA"/>
+    <w:lvl w:ilvl="0" w:tplc="5014724A">
       <w:start w:val="1"/>
       <w:numFmt w:val="decimal"/>
-      <w:lvlText w:val="%1、"/>
-      <w:lvlJc w:val="left"/>
-      <w:pPr>
-        <w:ind w:left="360" w:hanging="360"/>
-      </w:pPr>
-      <w:rPr>
-        <w:rFonts w:hint="default"/>
-      </w:rPr>
-    </w:lvl>
-    <w:lvl w:ilvl="1" w:tplc="04090019" w:tentative="1">
-      <w:start w:val="1"/>
-      <w:numFmt w:val="lowerLetter"/>
-      <w:lvlText w:val="%2)"/>
-      <w:lvlJc w:val="left"/>
-      <w:pPr>
-        <w:ind w:left="840" w:hanging="420"/>
-      </w:pPr>
-    </w:lvl>
-    <w:lvl w:ilvl="2" w:tplc="0409001B" w:tentative="1">
-      <w:start w:val="1"/>
-      <w:numFmt w:val="lowerRoman"/>
-      <w:lvlText w:val="%3."/>
-      <w:lvlJc w:val="right"/>
-      <w:pPr>
-        <w:ind w:left="1260" w:hanging="420"/>
-      </w:pPr>
-    </w:lvl>
-    <w:lvl w:ilvl="3" w:tplc="0409000F" w:tentative="1">
-      <w:start w:val="1"/>
-      <w:numFmt w:val="decimal"/>
-      <w:lvlText w:val="%4."/>
-      <w:lvlJc w:val="left"/>
-      <w:pPr>
-        <w:ind w:left="1680" w:hanging="420"/>
-      </w:pPr>
-    </w:lvl>
-    <w:lvl w:ilvl="4" w:tplc="04090019" w:tentative="1">
-      <w:start w:val="1"/>
-      <w:numFmt w:val="lowerLetter"/>
-      <w:lvlText w:val="%5)"/>
-      <w:lvlJc w:val="left"/>
-      <w:pPr>
-        <w:ind w:left="2100" w:hanging="420"/>
-      </w:pPr>
-    </w:lvl>
-    <w:lvl w:ilvl="5" w:tplc="0409001B" w:tentative="1">
-      <w:start w:val="1"/>
-      <w:numFmt w:val="lowerRoman"/>
-      <w:lvlText w:val="%6."/>
-      <w:lvlJc w:val="right"/>
-      <w:pPr>
-        <w:ind w:left="2520" w:hanging="420"/>
-      </w:pPr>
-    </w:lvl>
-    <w:lvl w:ilvl="6" w:tplc="0409000F" w:tentative="1">
-      <w:start w:val="1"/>
-      <w:numFmt w:val="decimal"/>
-      <w:lvlText w:val="%7."/>
-      <w:lvlJc w:val="left"/>
-      <w:pPr>
-        <w:ind w:left="2940" w:hanging="420"/>
-      </w:pPr>
-    </w:lvl>
-    <w:lvl w:ilvl="7" w:tplc="04090019" w:tentative="1">
-      <w:start w:val="1"/>
-      <w:numFmt w:val="lowerLetter"/>
-      <w:lvlText w:val="%8)"/>
-      <w:lvlJc w:val="left"/>
-      <w:pPr>
-        <w:ind w:left="3360" w:hanging="420"/>
-      </w:pPr>
-    </w:lvl>
-    <w:lvl w:ilvl="8" w:tplc="0409001B" w:tentative="1">
-      <w:start w:val="1"/>
-      <w:numFmt w:val="lowerRoman"/>
-      <w:lvlText w:val="%9."/>
-      <w:lvlJc w:val="right"/>
-      <w:pPr>
-        <w:ind w:left="3780" w:hanging="420"/>
-      </w:pPr>
-    </w:lvl>
-  </w:abstractNum>
-  <w:abstractNum w:abstractNumId="9">
-    <w:nsid w:val="375E3EC4"/>
-    <w:multiLevelType w:val="multilevel"/>
-    <w:tmpl w:val="0409001F"/>
-    <w:lvl w:ilvl="0">
-      <w:start w:val="1"/>
-      <w:numFmt w:val="decimal"/>
-      <w:lvlText w:val="%1."/>
-      <w:lvlJc w:val="left"/>
-      <w:pPr>
-        <w:ind w:left="425" w:hanging="425"/>
-      </w:pPr>
-    </w:lvl>
-    <w:lvl w:ilvl="1">
-      <w:start w:val="1"/>
-      <w:numFmt w:val="decimal"/>
-      <w:lvlText w:val="%1.%2."/>
-      <w:lvlJc w:val="left"/>
-      <w:pPr>
-        <w:ind w:left="567" w:hanging="567"/>
-      </w:pPr>
-    </w:lvl>
-    <w:lvl w:ilvl="2">
-      <w:start w:val="1"/>
-      <w:numFmt w:val="decimal"/>
-      <w:lvlText w:val="%1.%2.%3."/>
-      <w:lvlJc w:val="left"/>
-      <w:pPr>
-        <w:ind w:left="709" w:hanging="709"/>
-      </w:pPr>
-    </w:lvl>
-    <w:lvl w:ilvl="3">
-      <w:start w:val="1"/>
-      <w:numFmt w:val="decimal"/>
-      <w:lvlText w:val="%1.%2.%3.%4."/>
-      <w:lvlJc w:val="left"/>
-      <w:pPr>
-        <w:ind w:left="851" w:hanging="851"/>
-      </w:pPr>
-    </w:lvl>
-    <w:lvl w:ilvl="4">
-      <w:start w:val="1"/>
-      <w:numFmt w:val="decimal"/>
-      <w:lvlText w:val="%1.%2.%3.%4.%5."/>
-      <w:lvlJc w:val="left"/>
-      <w:pPr>
-        <w:ind w:left="992" w:hanging="992"/>
-      </w:pPr>
-    </w:lvl>
-    <w:lvl w:ilvl="5">
-      <w:start w:val="1"/>
-      <w:numFmt w:val="decimal"/>
-      <w:lvlText w:val="%1.%2.%3.%4.%5.%6."/>
-      <w:lvlJc w:val="left"/>
-      <w:pPr>
-        <w:ind w:left="1134" w:hanging="1134"/>
-      </w:pPr>
-    </w:lvl>
-    <w:lvl w:ilvl="6">
-      <w:start w:val="1"/>
-      <w:numFmt w:val="decimal"/>
-      <w:lvlText w:val="%1.%2.%3.%4.%5.%6.%7."/>
-      <w:lvlJc w:val="left"/>
-      <w:pPr>
-        <w:ind w:left="1276" w:hanging="1276"/>
-      </w:pPr>
-    </w:lvl>
-    <w:lvl w:ilvl="7">
-      <w:start w:val="1"/>
-      <w:numFmt w:val="decimal"/>
-      <w:lvlText w:val="%1.%2.%3.%4.%5.%6.%7.%8."/>
-      <w:lvlJc w:val="left"/>
-      <w:pPr>
-        <w:ind w:left="1418" w:hanging="1418"/>
-      </w:pPr>
-    </w:lvl>
-    <w:lvl w:ilvl="8">
-      <w:start w:val="1"/>
-      <w:numFmt w:val="decimal"/>
-      <w:lvlText w:val="%1.%2.%3.%4.%5.%6.%7.%8.%9."/>
-      <w:lvlJc w:val="left"/>
-      <w:pPr>
-        <w:ind w:left="1559" w:hanging="1559"/>
-      </w:pPr>
-    </w:lvl>
-  </w:abstractNum>
-  <w:abstractNum w:abstractNumId="10">
-    <w:nsid w:val="39011CD8"/>
-    <w:multiLevelType w:val="hybridMultilevel"/>
-    <w:tmpl w:val="707819CC"/>
-    <w:lvl w:ilvl="0" w:tplc="868C3356">
-      <w:start w:val="1"/>
-      <w:numFmt w:val="decimal"/>
-      <w:lvlText w:val="4.%1."/>
+      <w:lvlText w:val="1.%1."/>
       <w:lvlJc w:val="left"/>
       <w:pPr>
         <w:ind w:left="777" w:hanging="420"/>
@@ -7996,14 +9340,192 @@
       </w:pPr>
     </w:lvl>
   </w:abstractNum>
-  <w:abstractNum w:abstractNumId="11">
-    <w:nsid w:val="3BA97211"/>
+  <w:abstractNum w:abstractNumId="8">
+    <w:nsid w:val="2A7215BE"/>
     <w:multiLevelType w:val="hybridMultilevel"/>
-    <w:tmpl w:val="5DA4D8D4"/>
-    <w:lvl w:ilvl="0" w:tplc="F0D4944A">
+    <w:tmpl w:val="9D847B2C"/>
+    <w:lvl w:ilvl="0" w:tplc="9BCC915A">
       <w:start w:val="1"/>
       <w:numFmt w:val="decimal"/>
-      <w:lvlText w:val="6.%1."/>
+      <w:lvlText w:val="%1、"/>
+      <w:lvlJc w:val="left"/>
+      <w:pPr>
+        <w:ind w:left="360" w:hanging="360"/>
+      </w:pPr>
+      <w:rPr>
+        <w:rFonts w:hint="default"/>
+      </w:rPr>
+    </w:lvl>
+    <w:lvl w:ilvl="1" w:tplc="04090019" w:tentative="1">
+      <w:start w:val="1"/>
+      <w:numFmt w:val="lowerLetter"/>
+      <w:lvlText w:val="%2)"/>
+      <w:lvlJc w:val="left"/>
+      <w:pPr>
+        <w:ind w:left="840" w:hanging="420"/>
+      </w:pPr>
+    </w:lvl>
+    <w:lvl w:ilvl="2" w:tplc="0409001B" w:tentative="1">
+      <w:start w:val="1"/>
+      <w:numFmt w:val="lowerRoman"/>
+      <w:lvlText w:val="%3."/>
+      <w:lvlJc w:val="right"/>
+      <w:pPr>
+        <w:ind w:left="1260" w:hanging="420"/>
+      </w:pPr>
+    </w:lvl>
+    <w:lvl w:ilvl="3" w:tplc="0409000F" w:tentative="1">
+      <w:start w:val="1"/>
+      <w:numFmt w:val="decimal"/>
+      <w:lvlText w:val="%4."/>
+      <w:lvlJc w:val="left"/>
+      <w:pPr>
+        <w:ind w:left="1680" w:hanging="420"/>
+      </w:pPr>
+    </w:lvl>
+    <w:lvl w:ilvl="4" w:tplc="04090019" w:tentative="1">
+      <w:start w:val="1"/>
+      <w:numFmt w:val="lowerLetter"/>
+      <w:lvlText w:val="%5)"/>
+      <w:lvlJc w:val="left"/>
+      <w:pPr>
+        <w:ind w:left="2100" w:hanging="420"/>
+      </w:pPr>
+    </w:lvl>
+    <w:lvl w:ilvl="5" w:tplc="0409001B" w:tentative="1">
+      <w:start w:val="1"/>
+      <w:numFmt w:val="lowerRoman"/>
+      <w:lvlText w:val="%6."/>
+      <w:lvlJc w:val="right"/>
+      <w:pPr>
+        <w:ind w:left="2520" w:hanging="420"/>
+      </w:pPr>
+    </w:lvl>
+    <w:lvl w:ilvl="6" w:tplc="0409000F" w:tentative="1">
+      <w:start w:val="1"/>
+      <w:numFmt w:val="decimal"/>
+      <w:lvlText w:val="%7."/>
+      <w:lvlJc w:val="left"/>
+      <w:pPr>
+        <w:ind w:left="2940" w:hanging="420"/>
+      </w:pPr>
+    </w:lvl>
+    <w:lvl w:ilvl="7" w:tplc="04090019" w:tentative="1">
+      <w:start w:val="1"/>
+      <w:numFmt w:val="lowerLetter"/>
+      <w:lvlText w:val="%8)"/>
+      <w:lvlJc w:val="left"/>
+      <w:pPr>
+        <w:ind w:left="3360" w:hanging="420"/>
+      </w:pPr>
+    </w:lvl>
+    <w:lvl w:ilvl="8" w:tplc="0409001B" w:tentative="1">
+      <w:start w:val="1"/>
+      <w:numFmt w:val="lowerRoman"/>
+      <w:lvlText w:val="%9."/>
+      <w:lvlJc w:val="right"/>
+      <w:pPr>
+        <w:ind w:left="3780" w:hanging="420"/>
+      </w:pPr>
+    </w:lvl>
+  </w:abstractNum>
+  <w:abstractNum w:abstractNumId="9">
+    <w:nsid w:val="339640A5"/>
+    <w:multiLevelType w:val="hybridMultilevel"/>
+    <w:tmpl w:val="DBC828E0"/>
+    <w:lvl w:ilvl="0" w:tplc="B25E5DA4">
+      <w:start w:val="1"/>
+      <w:numFmt w:val="decimal"/>
+      <w:lvlText w:val="%1、"/>
+      <w:lvlJc w:val="left"/>
+      <w:pPr>
+        <w:ind w:left="360" w:hanging="360"/>
+      </w:pPr>
+      <w:rPr>
+        <w:rFonts w:hint="default"/>
+      </w:rPr>
+    </w:lvl>
+    <w:lvl w:ilvl="1" w:tplc="04090019" w:tentative="1">
+      <w:start w:val="1"/>
+      <w:numFmt w:val="lowerLetter"/>
+      <w:lvlText w:val="%2)"/>
+      <w:lvlJc w:val="left"/>
+      <w:pPr>
+        <w:ind w:left="840" w:hanging="420"/>
+      </w:pPr>
+    </w:lvl>
+    <w:lvl w:ilvl="2" w:tplc="0409001B" w:tentative="1">
+      <w:start w:val="1"/>
+      <w:numFmt w:val="lowerRoman"/>
+      <w:lvlText w:val="%3."/>
+      <w:lvlJc w:val="right"/>
+      <w:pPr>
+        <w:ind w:left="1260" w:hanging="420"/>
+      </w:pPr>
+    </w:lvl>
+    <w:lvl w:ilvl="3" w:tplc="0409000F" w:tentative="1">
+      <w:start w:val="1"/>
+      <w:numFmt w:val="decimal"/>
+      <w:lvlText w:val="%4."/>
+      <w:lvlJc w:val="left"/>
+      <w:pPr>
+        <w:ind w:left="1680" w:hanging="420"/>
+      </w:pPr>
+    </w:lvl>
+    <w:lvl w:ilvl="4" w:tplc="04090019" w:tentative="1">
+      <w:start w:val="1"/>
+      <w:numFmt w:val="lowerLetter"/>
+      <w:lvlText w:val="%5)"/>
+      <w:lvlJc w:val="left"/>
+      <w:pPr>
+        <w:ind w:left="2100" w:hanging="420"/>
+      </w:pPr>
+    </w:lvl>
+    <w:lvl w:ilvl="5" w:tplc="0409001B" w:tentative="1">
+      <w:start w:val="1"/>
+      <w:numFmt w:val="lowerRoman"/>
+      <w:lvlText w:val="%6."/>
+      <w:lvlJc w:val="right"/>
+      <w:pPr>
+        <w:ind w:left="2520" w:hanging="420"/>
+      </w:pPr>
+    </w:lvl>
+    <w:lvl w:ilvl="6" w:tplc="0409000F" w:tentative="1">
+      <w:start w:val="1"/>
+      <w:numFmt w:val="decimal"/>
+      <w:lvlText w:val="%7."/>
+      <w:lvlJc w:val="left"/>
+      <w:pPr>
+        <w:ind w:left="2940" w:hanging="420"/>
+      </w:pPr>
+    </w:lvl>
+    <w:lvl w:ilvl="7" w:tplc="04090019" w:tentative="1">
+      <w:start w:val="1"/>
+      <w:numFmt w:val="lowerLetter"/>
+      <w:lvlText w:val="%8)"/>
+      <w:lvlJc w:val="left"/>
+      <w:pPr>
+        <w:ind w:left="3360" w:hanging="420"/>
+      </w:pPr>
+    </w:lvl>
+    <w:lvl w:ilvl="8" w:tplc="0409001B" w:tentative="1">
+      <w:start w:val="1"/>
+      <w:numFmt w:val="lowerRoman"/>
+      <w:lvlText w:val="%9."/>
+      <w:lvlJc w:val="right"/>
+      <w:pPr>
+        <w:ind w:left="3780" w:hanging="420"/>
+      </w:pPr>
+    </w:lvl>
+  </w:abstractNum>
+  <w:abstractNum w:abstractNumId="10">
+    <w:nsid w:val="359D13A7"/>
+    <w:multiLevelType w:val="hybridMultilevel"/>
+    <w:tmpl w:val="1BCA5592"/>
+    <w:lvl w:ilvl="0" w:tplc="868C3356">
+      <w:start w:val="1"/>
+      <w:numFmt w:val="decimal"/>
+      <w:lvlText w:val="4.%1."/>
       <w:lvlJc w:val="left"/>
       <w:pPr>
         <w:ind w:left="777" w:hanging="420"/>
@@ -8088,99 +9610,96 @@
       </w:pPr>
     </w:lvl>
   </w:abstractNum>
+  <w:abstractNum w:abstractNumId="11">
+    <w:nsid w:val="375E3EC4"/>
+    <w:multiLevelType w:val="multilevel"/>
+    <w:tmpl w:val="0409001F"/>
+    <w:lvl w:ilvl="0">
+      <w:start w:val="1"/>
+      <w:numFmt w:val="decimal"/>
+      <w:lvlText w:val="%1."/>
+      <w:lvlJc w:val="left"/>
+      <w:pPr>
+        <w:ind w:left="425" w:hanging="425"/>
+      </w:pPr>
+    </w:lvl>
+    <w:lvl w:ilvl="1">
+      <w:start w:val="1"/>
+      <w:numFmt w:val="decimal"/>
+      <w:lvlText w:val="%1.%2."/>
+      <w:lvlJc w:val="left"/>
+      <w:pPr>
+        <w:ind w:left="567" w:hanging="567"/>
+      </w:pPr>
+    </w:lvl>
+    <w:lvl w:ilvl="2">
+      <w:start w:val="1"/>
+      <w:numFmt w:val="decimal"/>
+      <w:lvlText w:val="%1.%2.%3."/>
+      <w:lvlJc w:val="left"/>
+      <w:pPr>
+        <w:ind w:left="709" w:hanging="709"/>
+      </w:pPr>
+    </w:lvl>
+    <w:lvl w:ilvl="3">
+      <w:start w:val="1"/>
+      <w:numFmt w:val="decimal"/>
+      <w:lvlText w:val="%1.%2.%3.%4."/>
+      <w:lvlJc w:val="left"/>
+      <w:pPr>
+        <w:ind w:left="851" w:hanging="851"/>
+      </w:pPr>
+    </w:lvl>
+    <w:lvl w:ilvl="4">
+      <w:start w:val="1"/>
+      <w:numFmt w:val="decimal"/>
+      <w:lvlText w:val="%1.%2.%3.%4.%5."/>
+      <w:lvlJc w:val="left"/>
+      <w:pPr>
+        <w:ind w:left="992" w:hanging="992"/>
+      </w:pPr>
+    </w:lvl>
+    <w:lvl w:ilvl="5">
+      <w:start w:val="1"/>
+      <w:numFmt w:val="decimal"/>
+      <w:lvlText w:val="%1.%2.%3.%4.%5.%6."/>
+      <w:lvlJc w:val="left"/>
+      <w:pPr>
+        <w:ind w:left="1134" w:hanging="1134"/>
+      </w:pPr>
+    </w:lvl>
+    <w:lvl w:ilvl="6">
+      <w:start w:val="1"/>
+      <w:numFmt w:val="decimal"/>
+      <w:lvlText w:val="%1.%2.%3.%4.%5.%6.%7."/>
+      <w:lvlJc w:val="left"/>
+      <w:pPr>
+        <w:ind w:left="1276" w:hanging="1276"/>
+      </w:pPr>
+    </w:lvl>
+    <w:lvl w:ilvl="7">
+      <w:start w:val="1"/>
+      <w:numFmt w:val="decimal"/>
+      <w:lvlText w:val="%1.%2.%3.%4.%5.%6.%7.%8."/>
+      <w:lvlJc w:val="left"/>
+      <w:pPr>
+        <w:ind w:left="1418" w:hanging="1418"/>
+      </w:pPr>
+    </w:lvl>
+    <w:lvl w:ilvl="8">
+      <w:start w:val="1"/>
+      <w:numFmt w:val="decimal"/>
+      <w:lvlText w:val="%1.%2.%3.%4.%5.%6.%7.%8.%9."/>
+      <w:lvlJc w:val="left"/>
+      <w:pPr>
+        <w:ind w:left="1559" w:hanging="1559"/>
+      </w:pPr>
+    </w:lvl>
+  </w:abstractNum>
   <w:abstractNum w:abstractNumId="12">
-    <w:nsid w:val="44011B70"/>
+    <w:nsid w:val="39011CD8"/>
     <w:multiLevelType w:val="hybridMultilevel"/>
-    <w:tmpl w:val="3D0674C0"/>
-    <w:lvl w:ilvl="0" w:tplc="594E8DAA">
-      <w:start w:val="1"/>
-      <w:numFmt w:val="decimal"/>
-      <w:lvlText w:val="%1、"/>
-      <w:lvlJc w:val="left"/>
-      <w:pPr>
-        <w:ind w:left="717" w:hanging="360"/>
-      </w:pPr>
-      <w:rPr>
-        <w:rFonts w:hint="default"/>
-      </w:rPr>
-    </w:lvl>
-    <w:lvl w:ilvl="1" w:tplc="04090019" w:tentative="1">
-      <w:start w:val="1"/>
-      <w:numFmt w:val="lowerLetter"/>
-      <w:lvlText w:val="%2)"/>
-      <w:lvlJc w:val="left"/>
-      <w:pPr>
-        <w:ind w:left="1197" w:hanging="420"/>
-      </w:pPr>
-    </w:lvl>
-    <w:lvl w:ilvl="2" w:tplc="0409001B" w:tentative="1">
-      <w:start w:val="1"/>
-      <w:numFmt w:val="lowerRoman"/>
-      <w:lvlText w:val="%3."/>
-      <w:lvlJc w:val="right"/>
-      <w:pPr>
-        <w:ind w:left="1617" w:hanging="420"/>
-      </w:pPr>
-    </w:lvl>
-    <w:lvl w:ilvl="3" w:tplc="0409000F" w:tentative="1">
-      <w:start w:val="1"/>
-      <w:numFmt w:val="decimal"/>
-      <w:lvlText w:val="%4."/>
-      <w:lvlJc w:val="left"/>
-      <w:pPr>
-        <w:ind w:left="2037" w:hanging="420"/>
-      </w:pPr>
-    </w:lvl>
-    <w:lvl w:ilvl="4" w:tplc="04090019" w:tentative="1">
-      <w:start w:val="1"/>
-      <w:numFmt w:val="lowerLetter"/>
-      <w:lvlText w:val="%5)"/>
-      <w:lvlJc w:val="left"/>
-      <w:pPr>
-        <w:ind w:left="2457" w:hanging="420"/>
-      </w:pPr>
-    </w:lvl>
-    <w:lvl w:ilvl="5" w:tplc="0409001B" w:tentative="1">
-      <w:start w:val="1"/>
-      <w:numFmt w:val="lowerRoman"/>
-      <w:lvlText w:val="%6."/>
-      <w:lvlJc w:val="right"/>
-      <w:pPr>
-        <w:ind w:left="2877" w:hanging="420"/>
-      </w:pPr>
-    </w:lvl>
-    <w:lvl w:ilvl="6" w:tplc="0409000F" w:tentative="1">
-      <w:start w:val="1"/>
-      <w:numFmt w:val="decimal"/>
-      <w:lvlText w:val="%7."/>
-      <w:lvlJc w:val="left"/>
-      <w:pPr>
-        <w:ind w:left="3297" w:hanging="420"/>
-      </w:pPr>
-    </w:lvl>
-    <w:lvl w:ilvl="7" w:tplc="04090019" w:tentative="1">
-      <w:start w:val="1"/>
-      <w:numFmt w:val="lowerLetter"/>
-      <w:lvlText w:val="%8)"/>
-      <w:lvlJc w:val="left"/>
-      <w:pPr>
-        <w:ind w:left="3717" w:hanging="420"/>
-      </w:pPr>
-    </w:lvl>
-    <w:lvl w:ilvl="8" w:tplc="0409001B" w:tentative="1">
-      <w:start w:val="1"/>
-      <w:numFmt w:val="lowerRoman"/>
-      <w:lvlText w:val="%9."/>
-      <w:lvlJc w:val="right"/>
-      <w:pPr>
-        <w:ind w:left="4137" w:hanging="420"/>
-      </w:pPr>
-    </w:lvl>
-  </w:abstractNum>
-  <w:abstractNum w:abstractNumId="13">
-    <w:nsid w:val="476E1D40"/>
-    <w:multiLevelType w:val="hybridMultilevel"/>
-    <w:tmpl w:val="1BCA5592"/>
+    <w:tmpl w:val="707819CC"/>
     <w:lvl w:ilvl="0" w:tplc="868C3356">
       <w:start w:val="1"/>
       <w:numFmt w:val="decimal"/>
@@ -8269,281 +9788,14 @@
       </w:pPr>
     </w:lvl>
   </w:abstractNum>
-  <w:abstractNum w:abstractNumId="14">
-    <w:nsid w:val="47B65D4B"/>
+  <w:abstractNum w:abstractNumId="13">
+    <w:nsid w:val="3BA97211"/>
     <w:multiLevelType w:val="hybridMultilevel"/>
-    <w:tmpl w:val="A986ED8E"/>
-    <w:lvl w:ilvl="0" w:tplc="9D2E9A6C">
+    <w:tmpl w:val="5DA4D8D4"/>
+    <w:lvl w:ilvl="0" w:tplc="F0D4944A">
       <w:start w:val="1"/>
       <w:numFmt w:val="decimal"/>
-      <w:lvlText w:val="%1、"/>
-      <w:lvlJc w:val="left"/>
-      <w:pPr>
-        <w:ind w:left="360" w:hanging="360"/>
-      </w:pPr>
-      <w:rPr>
-        <w:rFonts w:hint="default"/>
-      </w:rPr>
-    </w:lvl>
-    <w:lvl w:ilvl="1" w:tplc="04090019">
-      <w:start w:val="1"/>
-      <w:numFmt w:val="lowerLetter"/>
-      <w:lvlText w:val="%2)"/>
-      <w:lvlJc w:val="left"/>
-      <w:pPr>
-        <w:ind w:left="840" w:hanging="420"/>
-      </w:pPr>
-    </w:lvl>
-    <w:lvl w:ilvl="2" w:tplc="0409001B" w:tentative="1">
-      <w:start w:val="1"/>
-      <w:numFmt w:val="lowerRoman"/>
-      <w:lvlText w:val="%3."/>
-      <w:lvlJc w:val="right"/>
-      <w:pPr>
-        <w:ind w:left="1260" w:hanging="420"/>
-      </w:pPr>
-    </w:lvl>
-    <w:lvl w:ilvl="3" w:tplc="0409000F" w:tentative="1">
-      <w:start w:val="1"/>
-      <w:numFmt w:val="decimal"/>
-      <w:lvlText w:val="%4."/>
-      <w:lvlJc w:val="left"/>
-      <w:pPr>
-        <w:ind w:left="1680" w:hanging="420"/>
-      </w:pPr>
-    </w:lvl>
-    <w:lvl w:ilvl="4" w:tplc="04090019" w:tentative="1">
-      <w:start w:val="1"/>
-      <w:numFmt w:val="lowerLetter"/>
-      <w:lvlText w:val="%5)"/>
-      <w:lvlJc w:val="left"/>
-      <w:pPr>
-        <w:ind w:left="2100" w:hanging="420"/>
-      </w:pPr>
-    </w:lvl>
-    <w:lvl w:ilvl="5" w:tplc="0409001B" w:tentative="1">
-      <w:start w:val="1"/>
-      <w:numFmt w:val="lowerRoman"/>
-      <w:lvlText w:val="%6."/>
-      <w:lvlJc w:val="right"/>
-      <w:pPr>
-        <w:ind w:left="2520" w:hanging="420"/>
-      </w:pPr>
-    </w:lvl>
-    <w:lvl w:ilvl="6" w:tplc="0409000F" w:tentative="1">
-      <w:start w:val="1"/>
-      <w:numFmt w:val="decimal"/>
-      <w:lvlText w:val="%7."/>
-      <w:lvlJc w:val="left"/>
-      <w:pPr>
-        <w:ind w:left="2940" w:hanging="420"/>
-      </w:pPr>
-    </w:lvl>
-    <w:lvl w:ilvl="7" w:tplc="04090019" w:tentative="1">
-      <w:start w:val="1"/>
-      <w:numFmt w:val="lowerLetter"/>
-      <w:lvlText w:val="%8)"/>
-      <w:lvlJc w:val="left"/>
-      <w:pPr>
-        <w:ind w:left="3360" w:hanging="420"/>
-      </w:pPr>
-    </w:lvl>
-    <w:lvl w:ilvl="8" w:tplc="0409001B" w:tentative="1">
-      <w:start w:val="1"/>
-      <w:numFmt w:val="lowerRoman"/>
-      <w:lvlText w:val="%9."/>
-      <w:lvlJc w:val="right"/>
-      <w:pPr>
-        <w:ind w:left="3780" w:hanging="420"/>
-      </w:pPr>
-    </w:lvl>
-  </w:abstractNum>
-  <w:abstractNum w:abstractNumId="15">
-    <w:nsid w:val="49FA439A"/>
-    <w:multiLevelType w:val="multilevel"/>
-    <w:tmpl w:val="0409001F"/>
-    <w:lvl w:ilvl="0">
-      <w:start w:val="1"/>
-      <w:numFmt w:val="decimal"/>
-      <w:lvlText w:val="%1."/>
-      <w:lvlJc w:val="left"/>
-      <w:pPr>
-        <w:ind w:left="425" w:hanging="425"/>
-      </w:pPr>
-    </w:lvl>
-    <w:lvl w:ilvl="1">
-      <w:start w:val="1"/>
-      <w:numFmt w:val="decimal"/>
-      <w:lvlText w:val="%1.%2."/>
-      <w:lvlJc w:val="left"/>
-      <w:pPr>
-        <w:ind w:left="567" w:hanging="567"/>
-      </w:pPr>
-    </w:lvl>
-    <w:lvl w:ilvl="2">
-      <w:start w:val="1"/>
-      <w:numFmt w:val="decimal"/>
-      <w:lvlText w:val="%1.%2.%3."/>
-      <w:lvlJc w:val="left"/>
-      <w:pPr>
-        <w:ind w:left="709" w:hanging="709"/>
-      </w:pPr>
-      <w:rPr>
-        <w:rFonts w:hint="eastAsia"/>
-      </w:rPr>
-    </w:lvl>
-    <w:lvl w:ilvl="3">
-      <w:start w:val="1"/>
-      <w:numFmt w:val="decimal"/>
-      <w:lvlText w:val="%1.%2.%3.%4."/>
-      <w:lvlJc w:val="left"/>
-      <w:pPr>
-        <w:ind w:left="851" w:hanging="851"/>
-      </w:pPr>
-    </w:lvl>
-    <w:lvl w:ilvl="4">
-      <w:start w:val="1"/>
-      <w:numFmt w:val="decimal"/>
-      <w:lvlText w:val="%1.%2.%3.%4.%5."/>
-      <w:lvlJc w:val="left"/>
-      <w:pPr>
-        <w:ind w:left="992" w:hanging="992"/>
-      </w:pPr>
-    </w:lvl>
-    <w:lvl w:ilvl="5">
-      <w:start w:val="1"/>
-      <w:numFmt w:val="decimal"/>
-      <w:lvlText w:val="%1.%2.%3.%4.%5.%6."/>
-      <w:lvlJc w:val="left"/>
-      <w:pPr>
-        <w:ind w:left="1134" w:hanging="1134"/>
-      </w:pPr>
-    </w:lvl>
-    <w:lvl w:ilvl="6">
-      <w:start w:val="1"/>
-      <w:numFmt w:val="decimal"/>
-      <w:lvlText w:val="%1.%2.%3.%4.%5.%6.%7."/>
-      <w:lvlJc w:val="left"/>
-      <w:pPr>
-        <w:ind w:left="1276" w:hanging="1276"/>
-      </w:pPr>
-    </w:lvl>
-    <w:lvl w:ilvl="7">
-      <w:start w:val="1"/>
-      <w:numFmt w:val="decimal"/>
-      <w:lvlText w:val="%1.%2.%3.%4.%5.%6.%7.%8."/>
-      <w:lvlJc w:val="left"/>
-      <w:pPr>
-        <w:ind w:left="1418" w:hanging="1418"/>
-      </w:pPr>
-    </w:lvl>
-    <w:lvl w:ilvl="8">
-      <w:start w:val="1"/>
-      <w:numFmt w:val="decimal"/>
-      <w:lvlText w:val="%1.%2.%3.%4.%5.%6.%7.%8.%9."/>
-      <w:lvlJc w:val="left"/>
-      <w:pPr>
-        <w:ind w:left="1559" w:hanging="1559"/>
-      </w:pPr>
-    </w:lvl>
-  </w:abstractNum>
-  <w:abstractNum w:abstractNumId="16">
-    <w:nsid w:val="4B6D52FD"/>
-    <w:multiLevelType w:val="hybridMultilevel"/>
-    <w:tmpl w:val="73BC9410"/>
-    <w:lvl w:ilvl="0" w:tplc="E9A4E554">
-      <w:start w:val="1"/>
-      <w:numFmt w:val="decimal"/>
-      <w:lvlText w:val="%1、"/>
-      <w:lvlJc w:val="left"/>
-      <w:pPr>
-        <w:ind w:left="717" w:hanging="360"/>
-      </w:pPr>
-      <w:rPr>
-        <w:rFonts w:hint="default"/>
-      </w:rPr>
-    </w:lvl>
-    <w:lvl w:ilvl="1" w:tplc="04090019" w:tentative="1">
-      <w:start w:val="1"/>
-      <w:numFmt w:val="lowerLetter"/>
-      <w:lvlText w:val="%2)"/>
-      <w:lvlJc w:val="left"/>
-      <w:pPr>
-        <w:ind w:left="1197" w:hanging="420"/>
-      </w:pPr>
-    </w:lvl>
-    <w:lvl w:ilvl="2" w:tplc="0409001B" w:tentative="1">
-      <w:start w:val="1"/>
-      <w:numFmt w:val="lowerRoman"/>
-      <w:lvlText w:val="%3."/>
-      <w:lvlJc w:val="right"/>
-      <w:pPr>
-        <w:ind w:left="1617" w:hanging="420"/>
-      </w:pPr>
-    </w:lvl>
-    <w:lvl w:ilvl="3" w:tplc="0409000F" w:tentative="1">
-      <w:start w:val="1"/>
-      <w:numFmt w:val="decimal"/>
-      <w:lvlText w:val="%4."/>
-      <w:lvlJc w:val="left"/>
-      <w:pPr>
-        <w:ind w:left="2037" w:hanging="420"/>
-      </w:pPr>
-    </w:lvl>
-    <w:lvl w:ilvl="4" w:tplc="04090019" w:tentative="1">
-      <w:start w:val="1"/>
-      <w:numFmt w:val="lowerLetter"/>
-      <w:lvlText w:val="%5)"/>
-      <w:lvlJc w:val="left"/>
-      <w:pPr>
-        <w:ind w:left="2457" w:hanging="420"/>
-      </w:pPr>
-    </w:lvl>
-    <w:lvl w:ilvl="5" w:tplc="0409001B" w:tentative="1">
-      <w:start w:val="1"/>
-      <w:numFmt w:val="lowerRoman"/>
-      <w:lvlText w:val="%6."/>
-      <w:lvlJc w:val="right"/>
-      <w:pPr>
-        <w:ind w:left="2877" w:hanging="420"/>
-      </w:pPr>
-    </w:lvl>
-    <w:lvl w:ilvl="6" w:tplc="0409000F" w:tentative="1">
-      <w:start w:val="1"/>
-      <w:numFmt w:val="decimal"/>
-      <w:lvlText w:val="%7."/>
-      <w:lvlJc w:val="left"/>
-      <w:pPr>
-        <w:ind w:left="3297" w:hanging="420"/>
-      </w:pPr>
-    </w:lvl>
-    <w:lvl w:ilvl="7" w:tplc="04090019" w:tentative="1">
-      <w:start w:val="1"/>
-      <w:numFmt w:val="lowerLetter"/>
-      <w:lvlText w:val="%8)"/>
-      <w:lvlJc w:val="left"/>
-      <w:pPr>
-        <w:ind w:left="3717" w:hanging="420"/>
-      </w:pPr>
-    </w:lvl>
-    <w:lvl w:ilvl="8" w:tplc="0409001B" w:tentative="1">
-      <w:start w:val="1"/>
-      <w:numFmt w:val="lowerRoman"/>
-      <w:lvlText w:val="%9."/>
-      <w:lvlJc w:val="right"/>
-      <w:pPr>
-        <w:ind w:left="4137" w:hanging="420"/>
-      </w:pPr>
-    </w:lvl>
-  </w:abstractNum>
-  <w:abstractNum w:abstractNumId="17">
-    <w:nsid w:val="58837255"/>
-    <w:multiLevelType w:val="hybridMultilevel"/>
-    <w:tmpl w:val="0DDC2956"/>
-    <w:lvl w:ilvl="0" w:tplc="9B7A0E8E">
-      <w:start w:val="1"/>
-      <w:numFmt w:val="decimal"/>
-      <w:lvlText w:val="%1."/>
+      <w:lvlText w:val="6.%1."/>
       <w:lvlJc w:val="left"/>
       <w:pPr>
         <w:ind w:left="777" w:hanging="420"/>
@@ -8628,19 +9880,21 @@
       </w:pPr>
     </w:lvl>
   </w:abstractNum>
-  <w:abstractNum w:abstractNumId="18">
-    <w:nsid w:val="589E00D2"/>
+  <w:abstractNum w:abstractNumId="14">
+    <w:nsid w:val="44011B70"/>
     <w:multiLevelType w:val="hybridMultilevel"/>
-    <w:tmpl w:val="712282AA"/>
-    <w:lvl w:ilvl="0" w:tplc="C4BE6AC0">
+    <w:tmpl w:val="3D0674C0"/>
+    <w:lvl w:ilvl="0" w:tplc="594E8DAA">
       <w:start w:val="1"/>
       <w:numFmt w:val="decimal"/>
-      <w:pStyle w:val="Heading3"/>
-      <w:lvlText w:val="%1."/>
-      <w:lvlJc w:val="left"/>
-      <w:pPr>
-        <w:ind w:left="777" w:hanging="420"/>
-      </w:pPr>
+      <w:lvlText w:val="%1、"/>
+      <w:lvlJc w:val="left"/>
+      <w:pPr>
+        <w:ind w:left="717" w:hanging="360"/>
+      </w:pPr>
+      <w:rPr>
+        <w:rFonts w:hint="default"/>
+      </w:rPr>
     </w:lvl>
     <w:lvl w:ilvl="1" w:tplc="04090019" w:tentative="1">
       <w:start w:val="1"/>
@@ -8715,10 +9969,10 @@
       </w:pPr>
     </w:lvl>
   </w:abstractNum>
-  <w:abstractNum w:abstractNumId="19">
-    <w:nsid w:val="5BCA1395"/>
+  <w:abstractNum w:abstractNumId="15">
+    <w:nsid w:val="476E1D40"/>
     <w:multiLevelType w:val="hybridMultilevel"/>
-    <w:tmpl w:val="F1F615A4"/>
+    <w:tmpl w:val="7FF69CB2"/>
     <w:lvl w:ilvl="0" w:tplc="868C3356">
       <w:start w:val="1"/>
       <w:numFmt w:val="decimal"/>
@@ -8807,10 +10061,10 @@
       </w:pPr>
     </w:lvl>
   </w:abstractNum>
-  <w:abstractNum w:abstractNumId="20">
-    <w:nsid w:val="5E3E40A4"/>
+  <w:abstractNum w:abstractNumId="16">
+    <w:nsid w:val="47B65D4B"/>
     <w:multiLevelType w:val="hybridMultilevel"/>
-    <w:tmpl w:val="9790D3FC"/>
+    <w:tmpl w:val="A986ED8E"/>
     <w:lvl w:ilvl="0" w:tplc="9D2E9A6C">
       <w:start w:val="1"/>
       <w:numFmt w:val="decimal"/>
@@ -8896,10 +10150,188 @@
       </w:pPr>
     </w:lvl>
   </w:abstractNum>
-  <w:abstractNum w:abstractNumId="21">
-    <w:nsid w:val="5F1C0970"/>
+  <w:abstractNum w:abstractNumId="17">
+    <w:nsid w:val="49FA439A"/>
+    <w:multiLevelType w:val="multilevel"/>
+    <w:tmpl w:val="0409001F"/>
+    <w:lvl w:ilvl="0">
+      <w:start w:val="1"/>
+      <w:numFmt w:val="decimal"/>
+      <w:lvlText w:val="%1."/>
+      <w:lvlJc w:val="left"/>
+      <w:pPr>
+        <w:ind w:left="425" w:hanging="425"/>
+      </w:pPr>
+    </w:lvl>
+    <w:lvl w:ilvl="1">
+      <w:start w:val="1"/>
+      <w:numFmt w:val="decimal"/>
+      <w:lvlText w:val="%1.%2."/>
+      <w:lvlJc w:val="left"/>
+      <w:pPr>
+        <w:ind w:left="567" w:hanging="567"/>
+      </w:pPr>
+    </w:lvl>
+    <w:lvl w:ilvl="2">
+      <w:start w:val="1"/>
+      <w:numFmt w:val="decimal"/>
+      <w:lvlText w:val="%1.%2.%3."/>
+      <w:lvlJc w:val="left"/>
+      <w:pPr>
+        <w:ind w:left="709" w:hanging="709"/>
+      </w:pPr>
+      <w:rPr>
+        <w:rFonts w:hint="eastAsia"/>
+      </w:rPr>
+    </w:lvl>
+    <w:lvl w:ilvl="3">
+      <w:start w:val="1"/>
+      <w:numFmt w:val="decimal"/>
+      <w:lvlText w:val="%1.%2.%3.%4."/>
+      <w:lvlJc w:val="left"/>
+      <w:pPr>
+        <w:ind w:left="851" w:hanging="851"/>
+      </w:pPr>
+    </w:lvl>
+    <w:lvl w:ilvl="4">
+      <w:start w:val="1"/>
+      <w:numFmt w:val="decimal"/>
+      <w:lvlText w:val="%1.%2.%3.%4.%5."/>
+      <w:lvlJc w:val="left"/>
+      <w:pPr>
+        <w:ind w:left="992" w:hanging="992"/>
+      </w:pPr>
+    </w:lvl>
+    <w:lvl w:ilvl="5">
+      <w:start w:val="1"/>
+      <w:numFmt w:val="decimal"/>
+      <w:lvlText w:val="%1.%2.%3.%4.%5.%6."/>
+      <w:lvlJc w:val="left"/>
+      <w:pPr>
+        <w:ind w:left="1134" w:hanging="1134"/>
+      </w:pPr>
+    </w:lvl>
+    <w:lvl w:ilvl="6">
+      <w:start w:val="1"/>
+      <w:numFmt w:val="decimal"/>
+      <w:lvlText w:val="%1.%2.%3.%4.%5.%6.%7."/>
+      <w:lvlJc w:val="left"/>
+      <w:pPr>
+        <w:ind w:left="1276" w:hanging="1276"/>
+      </w:pPr>
+    </w:lvl>
+    <w:lvl w:ilvl="7">
+      <w:start w:val="1"/>
+      <w:numFmt w:val="decimal"/>
+      <w:lvlText w:val="%1.%2.%3.%4.%5.%6.%7.%8."/>
+      <w:lvlJc w:val="left"/>
+      <w:pPr>
+        <w:ind w:left="1418" w:hanging="1418"/>
+      </w:pPr>
+    </w:lvl>
+    <w:lvl w:ilvl="8">
+      <w:start w:val="1"/>
+      <w:numFmt w:val="decimal"/>
+      <w:lvlText w:val="%1.%2.%3.%4.%5.%6.%7.%8.%9."/>
+      <w:lvlJc w:val="left"/>
+      <w:pPr>
+        <w:ind w:left="1559" w:hanging="1559"/>
+      </w:pPr>
+    </w:lvl>
+  </w:abstractNum>
+  <w:abstractNum w:abstractNumId="18">
+    <w:nsid w:val="4B6D52FD"/>
     <w:multiLevelType w:val="hybridMultilevel"/>
-    <w:tmpl w:val="A1666870"/>
+    <w:tmpl w:val="73BC9410"/>
+    <w:lvl w:ilvl="0" w:tplc="E9A4E554">
+      <w:start w:val="1"/>
+      <w:numFmt w:val="decimal"/>
+      <w:lvlText w:val="%1、"/>
+      <w:lvlJc w:val="left"/>
+      <w:pPr>
+        <w:ind w:left="717" w:hanging="360"/>
+      </w:pPr>
+      <w:rPr>
+        <w:rFonts w:hint="default"/>
+      </w:rPr>
+    </w:lvl>
+    <w:lvl w:ilvl="1" w:tplc="04090019" w:tentative="1">
+      <w:start w:val="1"/>
+      <w:numFmt w:val="lowerLetter"/>
+      <w:lvlText w:val="%2)"/>
+      <w:lvlJc w:val="left"/>
+      <w:pPr>
+        <w:ind w:left="1197" w:hanging="420"/>
+      </w:pPr>
+    </w:lvl>
+    <w:lvl w:ilvl="2" w:tplc="0409001B" w:tentative="1">
+      <w:start w:val="1"/>
+      <w:numFmt w:val="lowerRoman"/>
+      <w:lvlText w:val="%3."/>
+      <w:lvlJc w:val="right"/>
+      <w:pPr>
+        <w:ind w:left="1617" w:hanging="420"/>
+      </w:pPr>
+    </w:lvl>
+    <w:lvl w:ilvl="3" w:tplc="0409000F" w:tentative="1">
+      <w:start w:val="1"/>
+      <w:numFmt w:val="decimal"/>
+      <w:lvlText w:val="%4."/>
+      <w:lvlJc w:val="left"/>
+      <w:pPr>
+        <w:ind w:left="2037" w:hanging="420"/>
+      </w:pPr>
+    </w:lvl>
+    <w:lvl w:ilvl="4" w:tplc="04090019" w:tentative="1">
+      <w:start w:val="1"/>
+      <w:numFmt w:val="lowerLetter"/>
+      <w:lvlText w:val="%5)"/>
+      <w:lvlJc w:val="left"/>
+      <w:pPr>
+        <w:ind w:left="2457" w:hanging="420"/>
+      </w:pPr>
+    </w:lvl>
+    <w:lvl w:ilvl="5" w:tplc="0409001B" w:tentative="1">
+      <w:start w:val="1"/>
+      <w:numFmt w:val="lowerRoman"/>
+      <w:lvlText w:val="%6."/>
+      <w:lvlJc w:val="right"/>
+      <w:pPr>
+        <w:ind w:left="2877" w:hanging="420"/>
+      </w:pPr>
+    </w:lvl>
+    <w:lvl w:ilvl="6" w:tplc="0409000F" w:tentative="1">
+      <w:start w:val="1"/>
+      <w:numFmt w:val="decimal"/>
+      <w:lvlText w:val="%7."/>
+      <w:lvlJc w:val="left"/>
+      <w:pPr>
+        <w:ind w:left="3297" w:hanging="420"/>
+      </w:pPr>
+    </w:lvl>
+    <w:lvl w:ilvl="7" w:tplc="04090019" w:tentative="1">
+      <w:start w:val="1"/>
+      <w:numFmt w:val="lowerLetter"/>
+      <w:lvlText w:val="%8)"/>
+      <w:lvlJc w:val="left"/>
+      <w:pPr>
+        <w:ind w:left="3717" w:hanging="420"/>
+      </w:pPr>
+    </w:lvl>
+    <w:lvl w:ilvl="8" w:tplc="0409001B" w:tentative="1">
+      <w:start w:val="1"/>
+      <w:numFmt w:val="lowerRoman"/>
+      <w:lvlText w:val="%9."/>
+      <w:lvlJc w:val="right"/>
+      <w:pPr>
+        <w:ind w:left="4137" w:hanging="420"/>
+      </w:pPr>
+    </w:lvl>
+  </w:abstractNum>
+  <w:abstractNum w:abstractNumId="19">
+    <w:nsid w:val="58837255"/>
+    <w:multiLevelType w:val="hybridMultilevel"/>
+    <w:tmpl w:val="0DDC2956"/>
     <w:lvl w:ilvl="0" w:tplc="9B7A0E8E">
       <w:start w:val="1"/>
       <w:numFmt w:val="decimal"/>
@@ -8988,8 +10420,95 @@
       </w:pPr>
     </w:lvl>
   </w:abstractNum>
-  <w:abstractNum w:abstractNumId="22">
-    <w:nsid w:val="64EC10EB"/>
+  <w:abstractNum w:abstractNumId="20">
+    <w:nsid w:val="589E00D2"/>
+    <w:multiLevelType w:val="hybridMultilevel"/>
+    <w:tmpl w:val="712282AA"/>
+    <w:lvl w:ilvl="0" w:tplc="C4BE6AC0">
+      <w:start w:val="1"/>
+      <w:numFmt w:val="decimal"/>
+      <w:pStyle w:val="Heading3"/>
+      <w:lvlText w:val="%1."/>
+      <w:lvlJc w:val="left"/>
+      <w:pPr>
+        <w:ind w:left="777" w:hanging="420"/>
+      </w:pPr>
+    </w:lvl>
+    <w:lvl w:ilvl="1" w:tplc="04090019" w:tentative="1">
+      <w:start w:val="1"/>
+      <w:numFmt w:val="lowerLetter"/>
+      <w:lvlText w:val="%2)"/>
+      <w:lvlJc w:val="left"/>
+      <w:pPr>
+        <w:ind w:left="1197" w:hanging="420"/>
+      </w:pPr>
+    </w:lvl>
+    <w:lvl w:ilvl="2" w:tplc="0409001B" w:tentative="1">
+      <w:start w:val="1"/>
+      <w:numFmt w:val="lowerRoman"/>
+      <w:lvlText w:val="%3."/>
+      <w:lvlJc w:val="right"/>
+      <w:pPr>
+        <w:ind w:left="1617" w:hanging="420"/>
+      </w:pPr>
+    </w:lvl>
+    <w:lvl w:ilvl="3" w:tplc="0409000F" w:tentative="1">
+      <w:start w:val="1"/>
+      <w:numFmt w:val="decimal"/>
+      <w:lvlText w:val="%4."/>
+      <w:lvlJc w:val="left"/>
+      <w:pPr>
+        <w:ind w:left="2037" w:hanging="420"/>
+      </w:pPr>
+    </w:lvl>
+    <w:lvl w:ilvl="4" w:tplc="04090019" w:tentative="1">
+      <w:start w:val="1"/>
+      <w:numFmt w:val="lowerLetter"/>
+      <w:lvlText w:val="%5)"/>
+      <w:lvlJc w:val="left"/>
+      <w:pPr>
+        <w:ind w:left="2457" w:hanging="420"/>
+      </w:pPr>
+    </w:lvl>
+    <w:lvl w:ilvl="5" w:tplc="0409001B" w:tentative="1">
+      <w:start w:val="1"/>
+      <w:numFmt w:val="lowerRoman"/>
+      <w:lvlText w:val="%6."/>
+      <w:lvlJc w:val="right"/>
+      <w:pPr>
+        <w:ind w:left="2877" w:hanging="420"/>
+      </w:pPr>
+    </w:lvl>
+    <w:lvl w:ilvl="6" w:tplc="0409000F" w:tentative="1">
+      <w:start w:val="1"/>
+      <w:numFmt w:val="decimal"/>
+      <w:lvlText w:val="%7."/>
+      <w:lvlJc w:val="left"/>
+      <w:pPr>
+        <w:ind w:left="3297" w:hanging="420"/>
+      </w:pPr>
+    </w:lvl>
+    <w:lvl w:ilvl="7" w:tplc="04090019" w:tentative="1">
+      <w:start w:val="1"/>
+      <w:numFmt w:val="lowerLetter"/>
+      <w:lvlText w:val="%8)"/>
+      <w:lvlJc w:val="left"/>
+      <w:pPr>
+        <w:ind w:left="3717" w:hanging="420"/>
+      </w:pPr>
+    </w:lvl>
+    <w:lvl w:ilvl="8" w:tplc="0409001B" w:tentative="1">
+      <w:start w:val="1"/>
+      <w:numFmt w:val="lowerRoman"/>
+      <w:lvlText w:val="%9."/>
+      <w:lvlJc w:val="right"/>
+      <w:pPr>
+        <w:ind w:left="4137" w:hanging="420"/>
+      </w:pPr>
+    </w:lvl>
+  </w:abstractNum>
+  <w:abstractNum w:abstractNumId="21">
+    <w:nsid w:val="5BCA1395"/>
     <w:multiLevelType w:val="hybridMultilevel"/>
     <w:tmpl w:val="F1F615A4"/>
     <w:lvl w:ilvl="0" w:tplc="868C3356">
@@ -9080,17 +10599,106 @@
       </w:pPr>
     </w:lvl>
   </w:abstractNum>
+  <w:abstractNum w:abstractNumId="22">
+    <w:nsid w:val="5E3E40A4"/>
+    <w:multiLevelType w:val="hybridMultilevel"/>
+    <w:tmpl w:val="9790D3FC"/>
+    <w:lvl w:ilvl="0" w:tplc="9D2E9A6C">
+      <w:start w:val="1"/>
+      <w:numFmt w:val="decimal"/>
+      <w:lvlText w:val="%1、"/>
+      <w:lvlJc w:val="left"/>
+      <w:pPr>
+        <w:ind w:left="360" w:hanging="360"/>
+      </w:pPr>
+      <w:rPr>
+        <w:rFonts w:hint="default"/>
+      </w:rPr>
+    </w:lvl>
+    <w:lvl w:ilvl="1" w:tplc="04090019">
+      <w:start w:val="1"/>
+      <w:numFmt w:val="lowerLetter"/>
+      <w:lvlText w:val="%2)"/>
+      <w:lvlJc w:val="left"/>
+      <w:pPr>
+        <w:ind w:left="840" w:hanging="420"/>
+      </w:pPr>
+    </w:lvl>
+    <w:lvl w:ilvl="2" w:tplc="0409001B" w:tentative="1">
+      <w:start w:val="1"/>
+      <w:numFmt w:val="lowerRoman"/>
+      <w:lvlText w:val="%3."/>
+      <w:lvlJc w:val="right"/>
+      <w:pPr>
+        <w:ind w:left="1260" w:hanging="420"/>
+      </w:pPr>
+    </w:lvl>
+    <w:lvl w:ilvl="3" w:tplc="0409000F" w:tentative="1">
+      <w:start w:val="1"/>
+      <w:numFmt w:val="decimal"/>
+      <w:lvlText w:val="%4."/>
+      <w:lvlJc w:val="left"/>
+      <w:pPr>
+        <w:ind w:left="1680" w:hanging="420"/>
+      </w:pPr>
+    </w:lvl>
+    <w:lvl w:ilvl="4" w:tplc="04090019" w:tentative="1">
+      <w:start w:val="1"/>
+      <w:numFmt w:val="lowerLetter"/>
+      <w:lvlText w:val="%5)"/>
+      <w:lvlJc w:val="left"/>
+      <w:pPr>
+        <w:ind w:left="2100" w:hanging="420"/>
+      </w:pPr>
+    </w:lvl>
+    <w:lvl w:ilvl="5" w:tplc="0409001B" w:tentative="1">
+      <w:start w:val="1"/>
+      <w:numFmt w:val="lowerRoman"/>
+      <w:lvlText w:val="%6."/>
+      <w:lvlJc w:val="right"/>
+      <w:pPr>
+        <w:ind w:left="2520" w:hanging="420"/>
+      </w:pPr>
+    </w:lvl>
+    <w:lvl w:ilvl="6" w:tplc="0409000F" w:tentative="1">
+      <w:start w:val="1"/>
+      <w:numFmt w:val="decimal"/>
+      <w:lvlText w:val="%7."/>
+      <w:lvlJc w:val="left"/>
+      <w:pPr>
+        <w:ind w:left="2940" w:hanging="420"/>
+      </w:pPr>
+    </w:lvl>
+    <w:lvl w:ilvl="7" w:tplc="04090019" w:tentative="1">
+      <w:start w:val="1"/>
+      <w:numFmt w:val="lowerLetter"/>
+      <w:lvlText w:val="%8)"/>
+      <w:lvlJc w:val="left"/>
+      <w:pPr>
+        <w:ind w:left="3360" w:hanging="420"/>
+      </w:pPr>
+    </w:lvl>
+    <w:lvl w:ilvl="8" w:tplc="0409001B" w:tentative="1">
+      <w:start w:val="1"/>
+      <w:numFmt w:val="lowerRoman"/>
+      <w:lvlText w:val="%9."/>
+      <w:lvlJc w:val="right"/>
+      <w:pPr>
+        <w:ind w:left="3780" w:hanging="420"/>
+      </w:pPr>
+    </w:lvl>
+  </w:abstractNum>
   <w:abstractNum w:abstractNumId="23">
-    <w:nsid w:val="6965224B"/>
+    <w:nsid w:val="5F1C0970"/>
     <w:multiLevelType w:val="hybridMultilevel"/>
-    <w:tmpl w:val="7F020008"/>
-    <w:lvl w:ilvl="0" w:tplc="5014724A">
+    <w:tmpl w:val="A1666870"/>
+    <w:lvl w:ilvl="0" w:tplc="9B7A0E8E">
       <w:start w:val="1"/>
       <w:numFmt w:val="decimal"/>
-      <w:lvlText w:val="1.%1."/>
-      <w:lvlJc w:val="left"/>
-      <w:pPr>
-        <w:ind w:left="420" w:hanging="420"/>
+      <w:lvlText w:val="%1."/>
+      <w:lvlJc w:val="left"/>
+      <w:pPr>
+        <w:ind w:left="777" w:hanging="420"/>
       </w:pPr>
       <w:rPr>
         <w:rFonts w:hint="eastAsia"/>
@@ -9099,13 +10707,13 @@
         <w:position w:val="0"/>
       </w:rPr>
     </w:lvl>
-    <w:lvl w:ilvl="1" w:tplc="04090019">
+    <w:lvl w:ilvl="1" w:tplc="04090019" w:tentative="1">
       <w:start w:val="1"/>
       <w:numFmt w:val="lowerLetter"/>
       <w:lvlText w:val="%2)"/>
       <w:lvlJc w:val="left"/>
       <w:pPr>
-        <w:ind w:left="840" w:hanging="420"/>
+        <w:ind w:left="1197" w:hanging="420"/>
       </w:pPr>
     </w:lvl>
     <w:lvl w:ilvl="2" w:tplc="0409001B" w:tentative="1">
@@ -9114,16 +10722,16 @@
       <w:lvlText w:val="%3."/>
       <w:lvlJc w:val="right"/>
       <w:pPr>
-        <w:ind w:left="1260" w:hanging="420"/>
-      </w:pPr>
-    </w:lvl>
-    <w:lvl w:ilvl="3" w:tplc="0409000F">
+        <w:ind w:left="1617" w:hanging="420"/>
+      </w:pPr>
+    </w:lvl>
+    <w:lvl w:ilvl="3" w:tplc="0409000F" w:tentative="1">
       <w:start w:val="1"/>
       <w:numFmt w:val="decimal"/>
       <w:lvlText w:val="%4."/>
       <w:lvlJc w:val="left"/>
       <w:pPr>
-        <w:ind w:left="1680" w:hanging="420"/>
+        <w:ind w:left="2037" w:hanging="420"/>
       </w:pPr>
     </w:lvl>
     <w:lvl w:ilvl="4" w:tplc="04090019" w:tentative="1">
@@ -9132,7 +10740,7 @@
       <w:lvlText w:val="%5)"/>
       <w:lvlJc w:val="left"/>
       <w:pPr>
-        <w:ind w:left="2100" w:hanging="420"/>
+        <w:ind w:left="2457" w:hanging="420"/>
       </w:pPr>
     </w:lvl>
     <w:lvl w:ilvl="5" w:tplc="0409001B" w:tentative="1">
@@ -9141,7 +10749,7 @@
       <w:lvlText w:val="%6."/>
       <w:lvlJc w:val="right"/>
       <w:pPr>
-        <w:ind w:left="2520" w:hanging="420"/>
+        <w:ind w:left="2877" w:hanging="420"/>
       </w:pPr>
     </w:lvl>
     <w:lvl w:ilvl="6" w:tplc="0409000F" w:tentative="1">
@@ -9150,7 +10758,7 @@
       <w:lvlText w:val="%7."/>
       <w:lvlJc w:val="left"/>
       <w:pPr>
-        <w:ind w:left="2940" w:hanging="420"/>
+        <w:ind w:left="3297" w:hanging="420"/>
       </w:pPr>
     </w:lvl>
     <w:lvl w:ilvl="7" w:tplc="04090019" w:tentative="1">
@@ -9159,7 +10767,7 @@
       <w:lvlText w:val="%8)"/>
       <w:lvlJc w:val="left"/>
       <w:pPr>
-        <w:ind w:left="3360" w:hanging="420"/>
+        <w:ind w:left="3717" w:hanging="420"/>
       </w:pPr>
     </w:lvl>
     <w:lvl w:ilvl="8" w:tplc="0409001B" w:tentative="1">
@@ -9168,14 +10776,14 @@
       <w:lvlText w:val="%9."/>
       <w:lvlJc w:val="right"/>
       <w:pPr>
-        <w:ind w:left="3780" w:hanging="420"/>
+        <w:ind w:left="4137" w:hanging="420"/>
       </w:pPr>
     </w:lvl>
   </w:abstractNum>
   <w:abstractNum w:abstractNumId="24">
-    <w:nsid w:val="6E404E71"/>
+    <w:nsid w:val="64EC10EB"/>
     <w:multiLevelType w:val="hybridMultilevel"/>
-    <w:tmpl w:val="4684A18A"/>
+    <w:tmpl w:val="F1F615A4"/>
     <w:lvl w:ilvl="0" w:tplc="868C3356">
       <w:start w:val="1"/>
       <w:numFmt w:val="decimal"/>
@@ -9265,16 +10873,16 @@
     </w:lvl>
   </w:abstractNum>
   <w:abstractNum w:abstractNumId="25">
-    <w:nsid w:val="74071306"/>
+    <w:nsid w:val="6965224B"/>
     <w:multiLevelType w:val="hybridMultilevel"/>
-    <w:tmpl w:val="2D5A4038"/>
-    <w:lvl w:ilvl="0" w:tplc="EC8C497A">
+    <w:tmpl w:val="7F020008"/>
+    <w:lvl w:ilvl="0" w:tplc="5014724A">
       <w:start w:val="1"/>
       <w:numFmt w:val="decimal"/>
-      <w:lvlText w:val="5.%1."/>
-      <w:lvlJc w:val="left"/>
-      <w:pPr>
-        <w:ind w:left="777" w:hanging="420"/>
+      <w:lvlText w:val="1.%1."/>
+      <w:lvlJc w:val="left"/>
+      <w:pPr>
+        <w:ind w:left="420" w:hanging="420"/>
       </w:pPr>
       <w:rPr>
         <w:rFonts w:hint="eastAsia"/>
@@ -9283,13 +10891,13 @@
         <w:position w:val="0"/>
       </w:rPr>
     </w:lvl>
-    <w:lvl w:ilvl="1" w:tplc="04090019" w:tentative="1">
+    <w:lvl w:ilvl="1" w:tplc="04090019">
       <w:start w:val="1"/>
       <w:numFmt w:val="lowerLetter"/>
       <w:lvlText w:val="%2)"/>
       <w:lvlJc w:val="left"/>
       <w:pPr>
-        <w:ind w:left="1197" w:hanging="420"/>
+        <w:ind w:left="840" w:hanging="420"/>
       </w:pPr>
     </w:lvl>
     <w:lvl w:ilvl="2" w:tplc="0409001B" w:tentative="1">
@@ -9298,16 +10906,16 @@
       <w:lvlText w:val="%3."/>
       <w:lvlJc w:val="right"/>
       <w:pPr>
-        <w:ind w:left="1617" w:hanging="420"/>
-      </w:pPr>
-    </w:lvl>
-    <w:lvl w:ilvl="3" w:tplc="0409000F" w:tentative="1">
+        <w:ind w:left="1260" w:hanging="420"/>
+      </w:pPr>
+    </w:lvl>
+    <w:lvl w:ilvl="3" w:tplc="0409000F">
       <w:start w:val="1"/>
       <w:numFmt w:val="decimal"/>
       <w:lvlText w:val="%4."/>
       <w:lvlJc w:val="left"/>
       <w:pPr>
-        <w:ind w:left="2037" w:hanging="420"/>
+        <w:ind w:left="1680" w:hanging="420"/>
       </w:pPr>
     </w:lvl>
     <w:lvl w:ilvl="4" w:tplc="04090019" w:tentative="1">
@@ -9316,7 +10924,7 @@
       <w:lvlText w:val="%5)"/>
       <w:lvlJc w:val="left"/>
       <w:pPr>
-        <w:ind w:left="2457" w:hanging="420"/>
+        <w:ind w:left="2100" w:hanging="420"/>
       </w:pPr>
     </w:lvl>
     <w:lvl w:ilvl="5" w:tplc="0409001B" w:tentative="1">
@@ -9325,7 +10933,7 @@
       <w:lvlText w:val="%6."/>
       <w:lvlJc w:val="right"/>
       <w:pPr>
-        <w:ind w:left="2877" w:hanging="420"/>
+        <w:ind w:left="2520" w:hanging="420"/>
       </w:pPr>
     </w:lvl>
     <w:lvl w:ilvl="6" w:tplc="0409000F" w:tentative="1">
@@ -9334,7 +10942,7 @@
       <w:lvlText w:val="%7."/>
       <w:lvlJc w:val="left"/>
       <w:pPr>
-        <w:ind w:left="3297" w:hanging="420"/>
+        <w:ind w:left="2940" w:hanging="420"/>
       </w:pPr>
     </w:lvl>
     <w:lvl w:ilvl="7" w:tplc="04090019" w:tentative="1">
@@ -9343,7 +10951,7 @@
       <w:lvlText w:val="%8)"/>
       <w:lvlJc w:val="left"/>
       <w:pPr>
-        <w:ind w:left="3717" w:hanging="420"/>
+        <w:ind w:left="3360" w:hanging="420"/>
       </w:pPr>
     </w:lvl>
     <w:lvl w:ilvl="8" w:tplc="0409001B" w:tentative="1">
@@ -9352,101 +10960,12 @@
       <w:lvlText w:val="%9."/>
       <w:lvlJc w:val="right"/>
       <w:pPr>
-        <w:ind w:left="4137" w:hanging="420"/>
+        <w:ind w:left="3780" w:hanging="420"/>
       </w:pPr>
     </w:lvl>
   </w:abstractNum>
   <w:abstractNum w:abstractNumId="26">
-    <w:nsid w:val="7674114A"/>
-    <w:multiLevelType w:val="hybridMultilevel"/>
-    <w:tmpl w:val="4546F712"/>
-    <w:lvl w:ilvl="0" w:tplc="B25E5DA4">
-      <w:start w:val="1"/>
-      <w:numFmt w:val="decimal"/>
-      <w:lvlText w:val="%1、"/>
-      <w:lvlJc w:val="left"/>
-      <w:pPr>
-        <w:ind w:left="360" w:hanging="360"/>
-      </w:pPr>
-      <w:rPr>
-        <w:rFonts w:hint="default"/>
-      </w:rPr>
-    </w:lvl>
-    <w:lvl w:ilvl="1" w:tplc="04090019" w:tentative="1">
-      <w:start w:val="1"/>
-      <w:numFmt w:val="lowerLetter"/>
-      <w:lvlText w:val="%2)"/>
-      <w:lvlJc w:val="left"/>
-      <w:pPr>
-        <w:ind w:left="840" w:hanging="420"/>
-      </w:pPr>
-    </w:lvl>
-    <w:lvl w:ilvl="2" w:tplc="0409001B" w:tentative="1">
-      <w:start w:val="1"/>
-      <w:numFmt w:val="lowerRoman"/>
-      <w:lvlText w:val="%3."/>
-      <w:lvlJc w:val="right"/>
-      <w:pPr>
-        <w:ind w:left="1260" w:hanging="420"/>
-      </w:pPr>
-    </w:lvl>
-    <w:lvl w:ilvl="3" w:tplc="0409000F" w:tentative="1">
-      <w:start w:val="1"/>
-      <w:numFmt w:val="decimal"/>
-      <w:lvlText w:val="%4."/>
-      <w:lvlJc w:val="left"/>
-      <w:pPr>
-        <w:ind w:left="1680" w:hanging="420"/>
-      </w:pPr>
-    </w:lvl>
-    <w:lvl w:ilvl="4" w:tplc="04090019" w:tentative="1">
-      <w:start w:val="1"/>
-      <w:numFmt w:val="lowerLetter"/>
-      <w:lvlText w:val="%5)"/>
-      <w:lvlJc w:val="left"/>
-      <w:pPr>
-        <w:ind w:left="2100" w:hanging="420"/>
-      </w:pPr>
-    </w:lvl>
-    <w:lvl w:ilvl="5" w:tplc="0409001B" w:tentative="1">
-      <w:start w:val="1"/>
-      <w:numFmt w:val="lowerRoman"/>
-      <w:lvlText w:val="%6."/>
-      <w:lvlJc w:val="right"/>
-      <w:pPr>
-        <w:ind w:left="2520" w:hanging="420"/>
-      </w:pPr>
-    </w:lvl>
-    <w:lvl w:ilvl="6" w:tplc="0409000F" w:tentative="1">
-      <w:start w:val="1"/>
-      <w:numFmt w:val="decimal"/>
-      <w:lvlText w:val="%7."/>
-      <w:lvlJc w:val="left"/>
-      <w:pPr>
-        <w:ind w:left="2940" w:hanging="420"/>
-      </w:pPr>
-    </w:lvl>
-    <w:lvl w:ilvl="7" w:tplc="04090019" w:tentative="1">
-      <w:start w:val="1"/>
-      <w:numFmt w:val="lowerLetter"/>
-      <w:lvlText w:val="%8)"/>
-      <w:lvlJc w:val="left"/>
-      <w:pPr>
-        <w:ind w:left="3360" w:hanging="420"/>
-      </w:pPr>
-    </w:lvl>
-    <w:lvl w:ilvl="8" w:tplc="0409001B" w:tentative="1">
-      <w:start w:val="1"/>
-      <w:numFmt w:val="lowerRoman"/>
-      <w:lvlText w:val="%9."/>
-      <w:lvlJc w:val="right"/>
-      <w:pPr>
-        <w:ind w:left="3780" w:hanging="420"/>
-      </w:pPr>
-    </w:lvl>
-  </w:abstractNum>
-  <w:abstractNum w:abstractNumId="27">
-    <w:nsid w:val="7873230E"/>
+    <w:nsid w:val="6E404E71"/>
     <w:multiLevelType w:val="hybridMultilevel"/>
     <w:tmpl w:val="4684A18A"/>
     <w:lvl w:ilvl="0" w:tplc="868C3356">
@@ -9537,7 +11056,280 @@
       </w:pPr>
     </w:lvl>
   </w:abstractNum>
+  <w:abstractNum w:abstractNumId="27">
+    <w:nsid w:val="74071306"/>
+    <w:multiLevelType w:val="hybridMultilevel"/>
+    <w:tmpl w:val="2D5A4038"/>
+    <w:lvl w:ilvl="0" w:tplc="EC8C497A">
+      <w:start w:val="1"/>
+      <w:numFmt w:val="decimal"/>
+      <w:lvlText w:val="5.%1."/>
+      <w:lvlJc w:val="left"/>
+      <w:pPr>
+        <w:ind w:left="777" w:hanging="420"/>
+      </w:pPr>
+      <w:rPr>
+        <w:rFonts w:hint="eastAsia"/>
+        <w:spacing w:val="0"/>
+        <w:w w:val="100"/>
+        <w:position w:val="0"/>
+      </w:rPr>
+    </w:lvl>
+    <w:lvl w:ilvl="1" w:tplc="04090019" w:tentative="1">
+      <w:start w:val="1"/>
+      <w:numFmt w:val="lowerLetter"/>
+      <w:lvlText w:val="%2)"/>
+      <w:lvlJc w:val="left"/>
+      <w:pPr>
+        <w:ind w:left="1197" w:hanging="420"/>
+      </w:pPr>
+    </w:lvl>
+    <w:lvl w:ilvl="2" w:tplc="0409001B" w:tentative="1">
+      <w:start w:val="1"/>
+      <w:numFmt w:val="lowerRoman"/>
+      <w:lvlText w:val="%3."/>
+      <w:lvlJc w:val="right"/>
+      <w:pPr>
+        <w:ind w:left="1617" w:hanging="420"/>
+      </w:pPr>
+    </w:lvl>
+    <w:lvl w:ilvl="3" w:tplc="0409000F" w:tentative="1">
+      <w:start w:val="1"/>
+      <w:numFmt w:val="decimal"/>
+      <w:lvlText w:val="%4."/>
+      <w:lvlJc w:val="left"/>
+      <w:pPr>
+        <w:ind w:left="2037" w:hanging="420"/>
+      </w:pPr>
+    </w:lvl>
+    <w:lvl w:ilvl="4" w:tplc="04090019" w:tentative="1">
+      <w:start w:val="1"/>
+      <w:numFmt w:val="lowerLetter"/>
+      <w:lvlText w:val="%5)"/>
+      <w:lvlJc w:val="left"/>
+      <w:pPr>
+        <w:ind w:left="2457" w:hanging="420"/>
+      </w:pPr>
+    </w:lvl>
+    <w:lvl w:ilvl="5" w:tplc="0409001B" w:tentative="1">
+      <w:start w:val="1"/>
+      <w:numFmt w:val="lowerRoman"/>
+      <w:lvlText w:val="%6."/>
+      <w:lvlJc w:val="right"/>
+      <w:pPr>
+        <w:ind w:left="2877" w:hanging="420"/>
+      </w:pPr>
+    </w:lvl>
+    <w:lvl w:ilvl="6" w:tplc="0409000F" w:tentative="1">
+      <w:start w:val="1"/>
+      <w:numFmt w:val="decimal"/>
+      <w:lvlText w:val="%7."/>
+      <w:lvlJc w:val="left"/>
+      <w:pPr>
+        <w:ind w:left="3297" w:hanging="420"/>
+      </w:pPr>
+    </w:lvl>
+    <w:lvl w:ilvl="7" w:tplc="04090019" w:tentative="1">
+      <w:start w:val="1"/>
+      <w:numFmt w:val="lowerLetter"/>
+      <w:lvlText w:val="%8)"/>
+      <w:lvlJc w:val="left"/>
+      <w:pPr>
+        <w:ind w:left="3717" w:hanging="420"/>
+      </w:pPr>
+    </w:lvl>
+    <w:lvl w:ilvl="8" w:tplc="0409001B" w:tentative="1">
+      <w:start w:val="1"/>
+      <w:numFmt w:val="lowerRoman"/>
+      <w:lvlText w:val="%9."/>
+      <w:lvlJc w:val="right"/>
+      <w:pPr>
+        <w:ind w:left="4137" w:hanging="420"/>
+      </w:pPr>
+    </w:lvl>
+  </w:abstractNum>
   <w:abstractNum w:abstractNumId="28">
+    <w:nsid w:val="7674114A"/>
+    <w:multiLevelType w:val="hybridMultilevel"/>
+    <w:tmpl w:val="4546F712"/>
+    <w:lvl w:ilvl="0" w:tplc="B25E5DA4">
+      <w:start w:val="1"/>
+      <w:numFmt w:val="decimal"/>
+      <w:lvlText w:val="%1、"/>
+      <w:lvlJc w:val="left"/>
+      <w:pPr>
+        <w:ind w:left="360" w:hanging="360"/>
+      </w:pPr>
+      <w:rPr>
+        <w:rFonts w:hint="default"/>
+      </w:rPr>
+    </w:lvl>
+    <w:lvl w:ilvl="1" w:tplc="04090019" w:tentative="1">
+      <w:start w:val="1"/>
+      <w:numFmt w:val="lowerLetter"/>
+      <w:lvlText w:val="%2)"/>
+      <w:lvlJc w:val="left"/>
+      <w:pPr>
+        <w:ind w:left="840" w:hanging="420"/>
+      </w:pPr>
+    </w:lvl>
+    <w:lvl w:ilvl="2" w:tplc="0409001B" w:tentative="1">
+      <w:start w:val="1"/>
+      <w:numFmt w:val="lowerRoman"/>
+      <w:lvlText w:val="%3."/>
+      <w:lvlJc w:val="right"/>
+      <w:pPr>
+        <w:ind w:left="1260" w:hanging="420"/>
+      </w:pPr>
+    </w:lvl>
+    <w:lvl w:ilvl="3" w:tplc="0409000F" w:tentative="1">
+      <w:start w:val="1"/>
+      <w:numFmt w:val="decimal"/>
+      <w:lvlText w:val="%4."/>
+      <w:lvlJc w:val="left"/>
+      <w:pPr>
+        <w:ind w:left="1680" w:hanging="420"/>
+      </w:pPr>
+    </w:lvl>
+    <w:lvl w:ilvl="4" w:tplc="04090019" w:tentative="1">
+      <w:start w:val="1"/>
+      <w:numFmt w:val="lowerLetter"/>
+      <w:lvlText w:val="%5)"/>
+      <w:lvlJc w:val="left"/>
+      <w:pPr>
+        <w:ind w:left="2100" w:hanging="420"/>
+      </w:pPr>
+    </w:lvl>
+    <w:lvl w:ilvl="5" w:tplc="0409001B" w:tentative="1">
+      <w:start w:val="1"/>
+      <w:numFmt w:val="lowerRoman"/>
+      <w:lvlText w:val="%6."/>
+      <w:lvlJc w:val="right"/>
+      <w:pPr>
+        <w:ind w:left="2520" w:hanging="420"/>
+      </w:pPr>
+    </w:lvl>
+    <w:lvl w:ilvl="6" w:tplc="0409000F" w:tentative="1">
+      <w:start w:val="1"/>
+      <w:numFmt w:val="decimal"/>
+      <w:lvlText w:val="%7."/>
+      <w:lvlJc w:val="left"/>
+      <w:pPr>
+        <w:ind w:left="2940" w:hanging="420"/>
+      </w:pPr>
+    </w:lvl>
+    <w:lvl w:ilvl="7" w:tplc="04090019" w:tentative="1">
+      <w:start w:val="1"/>
+      <w:numFmt w:val="lowerLetter"/>
+      <w:lvlText w:val="%8)"/>
+      <w:lvlJc w:val="left"/>
+      <w:pPr>
+        <w:ind w:left="3360" w:hanging="420"/>
+      </w:pPr>
+    </w:lvl>
+    <w:lvl w:ilvl="8" w:tplc="0409001B" w:tentative="1">
+      <w:start w:val="1"/>
+      <w:numFmt w:val="lowerRoman"/>
+      <w:lvlText w:val="%9."/>
+      <w:lvlJc w:val="right"/>
+      <w:pPr>
+        <w:ind w:left="3780" w:hanging="420"/>
+      </w:pPr>
+    </w:lvl>
+  </w:abstractNum>
+  <w:abstractNum w:abstractNumId="29">
+    <w:nsid w:val="7873230E"/>
+    <w:multiLevelType w:val="hybridMultilevel"/>
+    <w:tmpl w:val="4684A18A"/>
+    <w:lvl w:ilvl="0" w:tplc="868C3356">
+      <w:start w:val="1"/>
+      <w:numFmt w:val="decimal"/>
+      <w:lvlText w:val="4.%1."/>
+      <w:lvlJc w:val="left"/>
+      <w:pPr>
+        <w:ind w:left="777" w:hanging="420"/>
+      </w:pPr>
+      <w:rPr>
+        <w:rFonts w:hint="eastAsia"/>
+        <w:spacing w:val="0"/>
+        <w:w w:val="100"/>
+        <w:position w:val="0"/>
+      </w:rPr>
+    </w:lvl>
+    <w:lvl w:ilvl="1" w:tplc="04090019" w:tentative="1">
+      <w:start w:val="1"/>
+      <w:numFmt w:val="lowerLetter"/>
+      <w:lvlText w:val="%2)"/>
+      <w:lvlJc w:val="left"/>
+      <w:pPr>
+        <w:ind w:left="1197" w:hanging="420"/>
+      </w:pPr>
+    </w:lvl>
+    <w:lvl w:ilvl="2" w:tplc="0409001B" w:tentative="1">
+      <w:start w:val="1"/>
+      <w:numFmt w:val="lowerRoman"/>
+      <w:lvlText w:val="%3."/>
+      <w:lvlJc w:val="right"/>
+      <w:pPr>
+        <w:ind w:left="1617" w:hanging="420"/>
+      </w:pPr>
+    </w:lvl>
+    <w:lvl w:ilvl="3" w:tplc="0409000F" w:tentative="1">
+      <w:start w:val="1"/>
+      <w:numFmt w:val="decimal"/>
+      <w:lvlText w:val="%4."/>
+      <w:lvlJc w:val="left"/>
+      <w:pPr>
+        <w:ind w:left="2037" w:hanging="420"/>
+      </w:pPr>
+    </w:lvl>
+    <w:lvl w:ilvl="4" w:tplc="04090019" w:tentative="1">
+      <w:start w:val="1"/>
+      <w:numFmt w:val="lowerLetter"/>
+      <w:lvlText w:val="%5)"/>
+      <w:lvlJc w:val="left"/>
+      <w:pPr>
+        <w:ind w:left="2457" w:hanging="420"/>
+      </w:pPr>
+    </w:lvl>
+    <w:lvl w:ilvl="5" w:tplc="0409001B" w:tentative="1">
+      <w:start w:val="1"/>
+      <w:numFmt w:val="lowerRoman"/>
+      <w:lvlText w:val="%6."/>
+      <w:lvlJc w:val="right"/>
+      <w:pPr>
+        <w:ind w:left="2877" w:hanging="420"/>
+      </w:pPr>
+    </w:lvl>
+    <w:lvl w:ilvl="6" w:tplc="0409000F" w:tentative="1">
+      <w:start w:val="1"/>
+      <w:numFmt w:val="decimal"/>
+      <w:lvlText w:val="%7."/>
+      <w:lvlJc w:val="left"/>
+      <w:pPr>
+        <w:ind w:left="3297" w:hanging="420"/>
+      </w:pPr>
+    </w:lvl>
+    <w:lvl w:ilvl="7" w:tplc="04090019" w:tentative="1">
+      <w:start w:val="1"/>
+      <w:numFmt w:val="lowerLetter"/>
+      <w:lvlText w:val="%8)"/>
+      <w:lvlJc w:val="left"/>
+      <w:pPr>
+        <w:ind w:left="3717" w:hanging="420"/>
+      </w:pPr>
+    </w:lvl>
+    <w:lvl w:ilvl="8" w:tplc="0409001B" w:tentative="1">
+      <w:start w:val="1"/>
+      <w:numFmt w:val="lowerRoman"/>
+      <w:lvlText w:val="%9."/>
+      <w:lvlJc w:val="right"/>
+      <w:pPr>
+        <w:ind w:left="4137" w:hanging="420"/>
+      </w:pPr>
+    </w:lvl>
+  </w:abstractNum>
+  <w:abstractNum w:abstractNumId="30">
     <w:nsid w:val="79E76E96"/>
     <w:multiLevelType w:val="hybridMultilevel"/>
     <w:tmpl w:val="5C26B3EA"/>
@@ -9630,10 +11422,10 @@
     <w:abstractNumId w:val="4"/>
   </w:num>
   <w:num w:numId="2">
-    <w:abstractNumId w:val="18"/>
+    <w:abstractNumId w:val="20"/>
   </w:num>
   <w:num w:numId="3">
-    <w:abstractNumId w:val="5"/>
+    <w:abstractNumId w:val="6"/>
   </w:num>
   <w:num w:numId="4">
     <w:abstractNumId w:val="4"/>
@@ -9642,93 +11434,99 @@
     <w:abstractNumId w:val="4"/>
   </w:num>
   <w:num w:numId="6">
-    <w:abstractNumId w:val="17"/>
+    <w:abstractNumId w:val="19"/>
   </w:num>
   <w:num w:numId="7">
-    <w:abstractNumId w:val="21"/>
+    <w:abstractNumId w:val="23"/>
   </w:num>
   <w:num w:numId="8">
     <w:abstractNumId w:val="0"/>
   </w:num>
   <w:num w:numId="9">
-    <w:abstractNumId w:val="6"/>
+    <w:abstractNumId w:val="7"/>
   </w:num>
   <w:num w:numId="10">
-    <w:abstractNumId w:val="18"/>
+    <w:abstractNumId w:val="20"/>
     <w:lvlOverride w:ilvl="0">
       <w:startOverride w:val="1"/>
     </w:lvlOverride>
   </w:num>
   <w:num w:numId="11">
-    <w:abstractNumId w:val="15"/>
+    <w:abstractNumId w:val="17"/>
   </w:num>
   <w:num w:numId="12">
-    <w:abstractNumId w:val="9"/>
+    <w:abstractNumId w:val="11"/>
   </w:num>
   <w:num w:numId="13">
     <w:abstractNumId w:val="3"/>
   </w:num>
   <w:num w:numId="14">
+    <w:abstractNumId w:val="20"/>
+  </w:num>
+  <w:num w:numId="15">
+    <w:abstractNumId w:val="25"/>
+  </w:num>
+  <w:num w:numId="16">
+    <w:abstractNumId w:val="15"/>
+  </w:num>
+  <w:num w:numId="17">
+    <w:abstractNumId w:val="27"/>
+  </w:num>
+  <w:num w:numId="18">
+    <w:abstractNumId w:val="13"/>
+  </w:num>
+  <w:num w:numId="19">
     <w:abstractNumId w:val="18"/>
   </w:num>
-  <w:num w:numId="15">
-    <w:abstractNumId w:val="23"/>
+  <w:num w:numId="20">
+    <w:abstractNumId w:val="14"/>
   </w:num>
-  <w:num w:numId="16">
-    <w:abstractNumId w:val="13"/>
+  <w:num w:numId="21">
+    <w:abstractNumId w:val="20"/>
   </w:num>
-  <w:num w:numId="17">
-    <w:abstractNumId w:val="25"/>
+  <w:num w:numId="22">
+    <w:abstractNumId w:val="30"/>
   </w:num>
-  <w:num w:numId="18">
-    <w:abstractNumId w:val="11"/>
+  <w:num w:numId="23">
+    <w:abstractNumId w:val="8"/>
   </w:num>
-  <w:num w:numId="19">
+  <w:num w:numId="24">
+    <w:abstractNumId w:val="22"/>
+  </w:num>
+  <w:num w:numId="25">
+    <w:abstractNumId w:val="9"/>
+  </w:num>
+  <w:num w:numId="26">
     <w:abstractNumId w:val="16"/>
   </w:num>
-  <w:num w:numId="20">
-    <w:abstractNumId w:val="12"/>
-  </w:num>
-  <w:num w:numId="21">
-    <w:abstractNumId w:val="18"/>
-  </w:num>
-  <w:num w:numId="22">
+  <w:num w:numId="27">
     <w:abstractNumId w:val="28"/>
   </w:num>
-  <w:num w:numId="23">
-    <w:abstractNumId w:val="7"/>
-  </w:num>
-  <w:num w:numId="24">
-    <w:abstractNumId w:val="20"/>
-  </w:num>
-  <w:num w:numId="25">
-    <w:abstractNumId w:val="8"/>
-  </w:num>
-  <w:num w:numId="26">
-    <w:abstractNumId w:val="14"/>
-  </w:num>
-  <w:num w:numId="27">
-    <w:abstractNumId w:val="26"/>
-  </w:num>
   <w:num w:numId="28">
-    <w:abstractNumId w:val="19"/>
+    <w:abstractNumId w:val="21"/>
   </w:num>
   <w:num w:numId="29">
-    <w:abstractNumId w:val="22"/>
+    <w:abstractNumId w:val="24"/>
   </w:num>
   <w:num w:numId="30">
-    <w:abstractNumId w:val="27"/>
+    <w:abstractNumId w:val="29"/>
   </w:num>
   <w:num w:numId="31">
     <w:abstractNumId w:val="2"/>
   </w:num>
   <w:num w:numId="32">
-    <w:abstractNumId w:val="24"/>
+    <w:abstractNumId w:val="26"/>
   </w:num>
   <w:num w:numId="33">
     <w:abstractNumId w:val="1"/>
   </w:num>
   <w:num w:numId="34">
+    <w:abstractNumId w:val="12"/>
+  </w:num>
+  <w:num w:numId="35">
+    <w:abstractNumId w:val="5"/>
+  </w:num>
+  <w:num w:numId="36">
     <w:abstractNumId w:val="10"/>
   </w:num>
 </w:numbering>
@@ -10322,7 +12120,7 @@
         <a:sysClr val="windowText" lastClr="000000"/>
       </a:dk1>
       <a:lt1>
-        <a:sysClr val="window" lastClr="C7EDCC"/>
+        <a:sysClr val="window" lastClr="FFFFFF"/>
       </a:lt1>
       <a:dk2>
         <a:srgbClr val="1F497D"/>

</xml_diff>

<commit_message>
SEQUOIADBMAINSTREAM-663: update queryandupdate of REST doc
git-svn-id: http://192.168.20.11/sequoiadb/trunk@18109 6121f079-4a18-41d3-8c30-8870a322f2c2
</commit_message>
<xml_diff>
--- a/internal_doc/03.开发设计/rest/sequoiadb Rest接口.docx
+++ b/internal_doc/03.开发设计/rest/sequoiadb Rest接口.docx
@@ -4079,9 +4079,6 @@
           <w:p>
             <w:pPr>
               <w:ind w:left="0"/>
-              <w:rPr>
-                <w:rFonts w:hint="eastAsia"/>
-              </w:rPr>
             </w:pPr>
             <w:r>
               <w:t>cmd</w:t>
@@ -4105,9 +4102,6 @@
           <w:p>
             <w:pPr>
               <w:ind w:left="0"/>
-              <w:rPr>
-                <w:rFonts w:hint="eastAsia"/>
-              </w:rPr>
             </w:pPr>
             <w:r>
               <w:t>name</w:t>
@@ -4163,7 +4157,13 @@
               <w:rPr>
                 <w:rFonts w:hint="eastAsia"/>
               </w:rPr>
-              <w:t xml:space="preserve">updator: </w:t>
+              <w:t>update</w:t>
+            </w:r>
+            <w:r>
+              <w:rPr>
+                <w:rFonts w:hint="eastAsia"/>
+              </w:rPr>
+              <w:t xml:space="preserve">: </w:t>
             </w:r>
             <w:r>
               <w:rPr>
@@ -4339,9 +4339,6 @@
           <w:p>
             <w:pPr>
               <w:ind w:left="0"/>
-              <w:rPr>
-                <w:rFonts w:hint="eastAsia"/>
-              </w:rPr>
             </w:pPr>
             <w:r>
               <w:rPr>
@@ -4455,7 +4452,13 @@
               <w:rPr>
                 <w:rFonts w:hint="eastAsia"/>
               </w:rPr>
-              <w:t>&amp;updator=</w:t>
+              <w:t>&amp;update</w:t>
+            </w:r>
+            <w:r>
+              <w:rPr>
+                <w:rFonts w:hint="eastAsia"/>
+              </w:rPr>
+              <w:t>=</w:t>
             </w:r>
             <w:r>
               <w:t>{$set:{"age":100}}</w:t>

</xml_diff>

<commit_message>
update queryandupdate of REST doc
git-svn-id: http://192.168.20.11/sequoiadb/trunk@18121 6121f079-4a18-41d3-8c30-8870a322f2c2
</commit_message>
<xml_diff>
--- a/internal_doc/03.开发设计/rest/sequoiadb Rest接口.docx
+++ b/internal_doc/03.开发设计/rest/sequoiadb Rest接口.docx
@@ -4157,7 +4157,7 @@
               <w:rPr>
                 <w:rFonts w:hint="eastAsia"/>
               </w:rPr>
-              <w:t>update</w:t>
+              <w:t>updator</w:t>
             </w:r>
             <w:r>
               <w:rPr>
@@ -4452,7 +4452,7 @@
               <w:rPr>
                 <w:rFonts w:hint="eastAsia"/>
               </w:rPr>
-              <w:t>&amp;update</w:t>
+              <w:t>&amp;updator</w:t>
             </w:r>
             <w:r>
               <w:rPr>
@@ -4474,6 +4474,12 @@
             </w:r>
             <w:r>
               <w:t>"}</w:t>
+            </w:r>
+            <w:r>
+              <w:rPr>
+                <w:rFonts w:hint="eastAsia"/>
+              </w:rPr>
+              <w:t>&amp;returnnew=true</w:t>
             </w:r>
           </w:p>
         </w:tc>

</xml_diff>